<commit_message>
Copa Manager: spec Notificacoes e Atalho do Atleta v1.1 (as-built)
Atualiza a EF para refletir o produto em producao (commit 6595ecc):
nome final do botao, tres estados do botao (2.2/RN-NT-03), notificacoes
derivadas sem tabela nem rota de "visto" (localStorage), aprovar-todas com
ignoradas, fases todas em producao e decisoes da secao 7 aplicadas.

Co-Authored-By: Claude Opus 4.8 <noreply@anthropic.com>
</commit_message>
<xml_diff>
--- a/ClaudeCode/CopaManager/CopaManager Notificacoes e Atalho do Atleta.docx
+++ b/ClaudeCode/CopaManager/CopaManager Notificacoes e Atalho do Atleta.docx
@@ -7,7 +7,7 @@
         <w:pStyle w:val="Titulo"/>
       </w:pPr>
       <w:r>
-        <w:t>Copa Manager</w:t>
+        <w:t xml:space="preserve">Copa Manager</w:t>
       </w:r>
     </w:p>
     <w:p>
@@ -15,7 +15,7 @@
         <w:pStyle w:val="Subtitulo"/>
       </w:pPr>
       <w:r>
-        <w:t>Notificações e Atalho do Atleta — o sininho e o caminho curto para se conectar</w:t>
+        <w:t xml:space="preserve">Notificações e Atalho do Atleta — o sininho e o caminho curto para se conectar</w:t>
       </w:r>
     </w:p>
     <w:p>
@@ -23,7 +23,7 @@
         <w:pStyle w:val="Muted"/>
       </w:pPr>
       <w:r>
-        <w:t>Documento de Especificação Funcional — Versão 1.0 (proposta para aprovação)</w:t>
+        <w:t xml:space="preserve">Documento de Especificação Funcional — Versão 1.1 (as-built, no ar em produção)</w:t>
       </w:r>
     </w:p>
     <w:p>
@@ -31,7 +31,7 @@
         <w:pStyle w:val="Muted"/>
       </w:pPr>
       <w:r>
-        <w:t>Data: 21/07/2026  •  Autor: Theo Paoliello (com assistência de IA)</w:t>
+        <w:t xml:space="preserve">Data: 21/07/2026  •  Autor: Theo Paoliello (com assistência de IA)</w:t>
       </w:r>
     </w:p>
     <w:p>
@@ -39,7 +39,7 @@
         <w:pStyle w:val="Muted"/>
       </w:pPr>
       <w:r>
-        <w:t>Produto em produção: https://copamanager.com.br</w:t>
+        <w:t xml:space="preserve">Produto em produção: https://copamanager.com.br</w:t>
       </w:r>
     </w:p>
     <w:p>
@@ -47,7 +47,7 @@
         <w:pStyle w:val="Muted"/>
       </w:pPr>
       <w:r>
-        <w:t>Base: EF “Perfil do Atleta” v1.0 (conexões de atleta, no ar desde 2026-07-21) e EF “Seguir Campeonatos” v1.1. Esta EF é puramente aditiva sobre as duas.</w:t>
+        <w:t xml:space="preserve">No ar desde 2026-07-21 (commit 6595ecc). Esta versão reflete o que foi efetivamente construído e as decisões da seção 7 já aplicadas. Base: EF “Perfil do Atleta” v1.0 e EF “Seguir Campeonatos” v1.1.</w:t>
       </w:r>
     </w:p>
     <w:p>
@@ -58,73 +58,64 @@
         <w:rPr>
           <w:b/>
         </w:rPr>
-        <w:t>Perfil do Atleta</w:t>
-      </w:r>
-      <w:r>
-        <w:t xml:space="preserve"> no ar, um jogador já pode vincular suas estatísticas a uma copa: ele </w:t>
-      </w:r>
-      <w:r>
-        <w:rPr>
-          <w:b/>
-        </w:rPr>
-        <w:t>segue</w:t>
-      </w:r>
-      <w:r>
-        <w:t xml:space="preserve"> o campeonato, abre “Me conectar à Copa”, escolhe seu nome no elenco e envia a solicitação; o organizador então aprova na aba </w:t>
-      </w:r>
-      <w:r>
-        <w:rPr>
-          <w:b/>
-        </w:rPr>
-        <w:t>Atletas</w:t>
-      </w:r>
-      <w:r>
-        <w:t xml:space="preserve"> da competição. O fluxo funciona, mas tem duas asperezas. Do lado do </w:t>
-      </w:r>
-      <w:r>
-        <w:rPr>
-          <w:b/>
-        </w:rPr>
-        <w:t>atleta</w:t>
-      </w:r>
-      <w:r>
-        <w:t xml:space="preserve">, o caminho é longo e pouco óbvio — ele precisa descobrir sozinho que primeiro tem de seguir a copa e só depois procurar o modal de conexão. Do lado do </w:t>
-      </w:r>
-      <w:r>
-        <w:rPr>
-          <w:b/>
-        </w:rPr>
-        <w:t>gestor</w:t>
-      </w:r>
-      <w:r>
-        <w:t xml:space="preserve">, não existe nenhum aviso de que há gente esperando: as solicitações só aparecem para quem entra na competição e abre a aba Atletas, uma a uma. Esta especificação resolve os dois lados com </w:t>
-      </w:r>
-      <w:r>
-        <w:rPr>
-          <w:b/>
-        </w:rPr>
-        <w:t>um atalho na página pública</w:t>
-      </w:r>
-      <w:r>
-        <w:t xml:space="preserve"> e uma </w:t>
-      </w:r>
-      <w:r>
-        <w:rPr>
-          <w:b/>
-        </w:rPr>
-        <w:t>central de notificações</w:t>
-      </w:r>
-      <w:r>
-        <w:t xml:space="preserve"> (o clássico sininho no topo do app), além de um botão para </w:t>
-      </w:r>
-      <w:r>
-        <w:rPr>
-          <w:b/>
-        </w:rPr>
-        <w:t>aprovar todas as solicitações de uma vez</w:t>
-      </w:r>
-      <w:r>
-        <w:t>.</w:t>
+        <w:t xml:space="preserve">Perfil do Atleta</w:t>
+      </w:r>
+      <w:r>
+        <w:t xml:space="preserve"> no ar, um jogador já podia vincular suas estatísticas a uma copa: seguir o campeonato, abrir “Me conectar à Copa”, escolher seu nome no elenco e enviar a solicitação; o organizador aprovava na aba </w:t>
+      </w:r>
+      <w:r>
+        <w:rPr>
+          <w:b/>
+        </w:rPr>
+        <w:t xml:space="preserve">Atletas</w:t>
+      </w:r>
+      <w:r>
+        <w:t xml:space="preserve">. O fluxo funcionava, mas com duas asperezas. Do lado do </w:t>
+      </w:r>
+      <w:r>
+        <w:rPr>
+          <w:b/>
+        </w:rPr>
+        <w:t xml:space="preserve">atleta</w:t>
+      </w:r>
+      <w:r>
+        <w:t xml:space="preserve">, o caminho era longo e pouco óbvio. Do lado do </w:t>
+      </w:r>
+      <w:r>
+        <w:rPr>
+          <w:b/>
+        </w:rPr>
+        <w:t xml:space="preserve">gestor</w:t>
+      </w:r>
+      <w:r>
+        <w:t xml:space="preserve">, não havia aviso de que alguém esperava: as solicitações só apareciam para quem entrava na competição e abria a aba Atletas. Esta especificação resolveu os dois lados com </w:t>
+      </w:r>
+      <w:r>
+        <w:rPr>
+          <w:b/>
+        </w:rPr>
+        <w:t xml:space="preserve">um atalho na página pública</w:t>
+      </w:r>
+      <w:r>
+        <w:t xml:space="preserve">, uma </w:t>
+      </w:r>
+      <w:r>
+        <w:rPr>
+          <w:b/>
+        </w:rPr>
+        <w:t xml:space="preserve">central de notificações</w:t>
+      </w:r>
+      <w:r>
+        <w:t xml:space="preserve"> (o sininho no topo do app) e um botão para </w:t>
+      </w:r>
+      <w:r>
+        <w:rPr>
+          <w:b/>
+        </w:rPr>
+        <w:t xml:space="preserve">aprovar todas as solicitações de uma vez</w:t>
+      </w:r>
+      <w:r>
+        <w:t xml:space="preserve">. Tudo entregue e em produção.</w:t>
       </w:r>
     </w:p>
     <w:p>
@@ -132,12 +123,12 @@
         <w:pStyle w:val="Heading1"/>
       </w:pPr>
       <w:r>
-        <w:t>1. Conceito e motivação</w:t>
-      </w:r>
-    </w:p>
-    <w:p>
-      <w:r>
-        <w:t>São quatro entregas complementares, unidas por um objetivo: encurtar a distância entre “quero participar” (atleta) e “alguém está pedindo para participar” (gestor).</w:t>
+        <w:t xml:space="preserve">1. Conceito e motivação</w:t>
+      </w:r>
+    </w:p>
+    <w:p>
+      <w:r>
+        <w:t xml:space="preserve">Quatro entregas complementares, unidas por um objetivo: encurtar a distância entre “quero participar” (atleta) e “alguém está pedindo para participar” (gestor).</w:t>
       </w:r>
     </w:p>
     <w:p>
@@ -148,10 +139,19 @@
         <w:rPr>
           <w:b/>
         </w:rPr>
-        <w:t>Atalho do atleta:</w:t>
-      </w:r>
-      <w:r>
-        <w:t xml:space="preserve"> um botão na página pública da copa que, num toque, já segue a competição e abre a tela de conexão com ela pré-selecionada. Menos passos, mais atletas conectados.</w:t>
+        <w:t xml:space="preserve">Atalho do atleta:</w:t>
+      </w:r>
+      <w:r>
+        <w:t xml:space="preserve"> um botão na página pública que, num toque, segue a competição e abre a tela de conexão com ela pré-selecionada. O mesmo botão passou a </w:t>
+      </w:r>
+      <w:r>
+        <w:rPr>
+          <w:b/>
+        </w:rPr>
+        <w:t xml:space="preserve">refletir o estado</w:t>
+      </w:r>
+      <w:r>
+        <w:t xml:space="preserve"> do atleta naquela copa (ver 2.2).</w:t>
       </w:r>
     </w:p>
     <w:p>
@@ -162,10 +162,10 @@
         <w:rPr>
           <w:b/>
         </w:rPr>
-        <w:t>Central de notificações:</w:t>
-      </w:r>
-      <w:r>
-        <w:t xml:space="preserve"> o sininho no topo reúne, num só lugar, o que exige a atenção da pessoa — começando pelas solicitações de conexão que o gestor precisa avaliar.</w:t>
+        <w:t xml:space="preserve">Central de notificações:</w:t>
+      </w:r>
+      <w:r>
+        <w:t xml:space="preserve"> o sininho no topo reúne, num só lugar, o que exige a atenção da pessoa — no MVP, as solicitações de conexão que o gestor precisa avaliar.</w:t>
       </w:r>
     </w:p>
     <w:p>
@@ -176,10 +176,10 @@
         <w:rPr>
           <w:b/>
         </w:rPr>
-        <w:t>Aviso ao gestor:</w:t>
-      </w:r>
-      <w:r>
-        <w:t xml:space="preserve"> quem organiza descobre na hora que há atletas querendo se conectar, sem precisar vasculhar cada campeonato. Solicitações da mesma copa somam numa notificação só.</w:t>
+        <w:t xml:space="preserve">Aviso ao gestor:</w:t>
+      </w:r>
+      <w:r>
+        <w:t xml:space="preserve"> quem organiza descobre na hora que há atletas querendo se conectar, sem vasculhar cada campeonato. Solicitações da mesma copa somam numa notificação só.</w:t>
       </w:r>
     </w:p>
     <w:p>
@@ -190,21 +190,21 @@
         <w:rPr>
           <w:b/>
         </w:rPr>
-        <w:t>Aprovar em lote:</w:t>
-      </w:r>
-      <w:r>
-        <w:t xml:space="preserve"> para o gestor que confia na sua lista, um botão aceita todas as solicitações pendentes de uma copa de uma vez.</w:t>
-      </w:r>
-    </w:p>
-    <w:p>
-      <w:r>
-        <w:t xml:space="preserve">O recurso não altera nenhuma regra de posse, conexão ou privacidade já existentes: aprovar uma conexão continua </w:t>
-      </w:r>
-      <w:r>
-        <w:rPr>
-          <w:b/>
-        </w:rPr>
-        <w:t>não dando nenhum acesso</w:t>
+        <w:t xml:space="preserve">Aprovar em lote:</w:t>
+      </w:r>
+      <w:r>
+        <w:t xml:space="preserve"> um botão aceita todas as solicitações pendentes de uma copa de uma vez, com confirmação.</w:t>
+      </w:r>
+    </w:p>
+    <w:p>
+      <w:r>
+        <w:t xml:space="preserve">Nenhuma regra de posse, conexão ou privacidade existente mudou: aprovar uma conexão continua </w:t>
+      </w:r>
+      <w:r>
+        <w:rPr>
+          <w:b/>
+        </w:rPr>
+        <w:t xml:space="preserve">não dando nenhum acesso</w:t>
       </w:r>
       <w:r>
         <w:t xml:space="preserve"> de gestão ao atleta — ele apenas passa a ver as próprias estatísticas.</w:t>
@@ -215,7 +215,7 @@
         <w:pStyle w:val="Heading1"/>
       </w:pPr>
       <w:r>
-        <w:t>2. Experiência do usuário</w:t>
+        <w:t xml:space="preserve">2. Experiência do usuário</w:t>
       </w:r>
     </w:p>
     <w:p>
@@ -223,18 +223,18 @@
         <w:pStyle w:val="Heading3"/>
       </w:pPr>
       <w:r>
-        <w:t>2.1 Botão “Jogo nesta Copa” na página pública (o atalho)</w:t>
-      </w:r>
-    </w:p>
-    <w:p>
-      <w:r>
-        <w:t xml:space="preserve">•  Aparece no cabeçalho de `/c/:slug`, ao lado dos botões </w:t>
-      </w:r>
-      <w:r>
-        <w:rPr>
-          <w:b/>
-        </w:rPr>
-        <w:t>“Seguir esta Copa”</w:t>
+        <w:t xml:space="preserve">2.1 Botão “Eu jogo nesta Copa” na página pública (o atalho)</w:t>
+      </w:r>
+    </w:p>
+    <w:p>
+      <w:r>
+        <w:t xml:space="preserve">•  Fica no cabeçalho de `/c/:slug`, ao lado de </w:t>
+      </w:r>
+      <w:r>
+        <w:rPr>
+          <w:b/>
+        </w:rPr>
+        <w:t xml:space="preserve">“Seguir esta Copa”</w:t>
       </w:r>
       <w:r>
         <w:t xml:space="preserve"> e </w:t>
@@ -243,76 +243,61 @@
         <w:rPr>
           <w:b/>
         </w:rPr>
-        <w:t>“Compartilhar”</w:t>
-      </w:r>
-      <w:r>
-        <w:t xml:space="preserve"> já existentes.</w:t>
-      </w:r>
-    </w:p>
-    <w:p>
-      <w:r>
-        <w:t xml:space="preserve">•  Só aparece quando a copa </w:t>
-      </w:r>
-      <w:r>
-        <w:rPr>
-          <w:b/>
-        </w:rPr>
-        <w:t>aceita conexões de atletas</w:t>
-      </w:r>
-      <w:r>
-        <w:t xml:space="preserve"> (flag `aceita_conexoes`). Se o organizador desligou esse recurso, o botão fica oculto — não há para onde levar.</w:t>
-      </w:r>
-    </w:p>
-    <w:p>
-      <w:r>
-        <w:t xml:space="preserve">•  Ao clicar, o app </w:t>
-      </w:r>
-      <w:r>
-        <w:rPr>
-          <w:b/>
-        </w:rPr>
-        <w:t>segue a copa</w:t>
-      </w:r>
-      <w:r>
-        <w:t xml:space="preserve"> (se ainda não seguia) e </w:t>
-      </w:r>
-      <w:r>
-        <w:rPr>
-          <w:b/>
-        </w:rPr>
-        <w:t>abre a tela “Me conectar à Copa” já com essa competição selecionada</w:t>
-      </w:r>
-      <w:r>
-        <w:t>, pulando direto para a escolha do time/jogador.</w:t>
-      </w:r>
-    </w:p>
-    <w:p>
-      <w:r>
-        <w:lastRenderedPageBreak/>
-        <w:t xml:space="preserve">•  É um </w:t>
-      </w:r>
-      <w:r>
-        <w:rPr>
-          <w:b/>
-        </w:rPr>
-        <w:t>atalho</w:t>
-      </w:r>
-      <w:r>
-        <w:t>, não um novo caminho: ele reaproveita exatamente o fluxo de conexão da EF Perfil do Atleta (seguir → conectar). O que muda é que a pessoa não precisa mais descobrir os passos sozinha.</w:t>
-      </w:r>
-    </w:p>
-    <w:p>
-      <w:r>
-        <w:t xml:space="preserve">Sugestões de nome para o botão (a decidir — ver seção 7): </w:t>
-      </w:r>
-      <w:r>
-        <w:rPr>
-          <w:b/>
-        </w:rPr>
-        <w:t>“Jogo nesta Copa”</w:t>
-      </w:r>
-      <w:r>
-        <w:t xml:space="preserve"> (recomendado, curto e convidativo), “Sou atleta desta Copa”, “Sou atleta”, “Conectar meu perfil”, “Jogo aqui”.</w:t>
+        <w:t xml:space="preserve">“Compartilhar”</w:t>
+      </w:r>
+      <w:r>
+        <w:t xml:space="preserve">.</w:t>
+      </w:r>
+    </w:p>
+    <w:p>
+      <w:r>
+        <w:t xml:space="preserve">•  Aparece quando a copa </w:t>
+      </w:r>
+      <w:r>
+        <w:rPr>
+          <w:b/>
+        </w:rPr>
+        <w:t xml:space="preserve">aceita conexões de atletas</w:t>
+      </w:r>
+      <w:r>
+        <w:t xml:space="preserve"> (flag `aceita_conexoes`) — ou quando o atleta </w:t>
+      </w:r>
+      <w:r>
+        <w:rPr>
+          <w:b/>
+        </w:rPr>
+        <w:t xml:space="preserve">já está conectado</w:t>
+      </w:r>
+      <w:r>
+        <w:t xml:space="preserve"> (aí o botão vira status; ver 2.2).</w:t>
+      </w:r>
+    </w:p>
+    <w:p>
+      <w:r>
+        <w:t xml:space="preserve">•  Ao clicar (sem conexão), o app </w:t>
+      </w:r>
+      <w:r>
+        <w:rPr>
+          <w:b/>
+        </w:rPr>
+        <w:t xml:space="preserve">segue a copa</w:t>
+      </w:r>
+      <w:r>
+        <w:t xml:space="preserve"> e </w:t>
+      </w:r>
+      <w:r>
+        <w:rPr>
+          <w:b/>
+        </w:rPr>
+        <w:t xml:space="preserve">abre “Me conectar à Copa” já com essa competição selecionada</w:t>
+      </w:r>
+      <w:r>
+        <w:t xml:space="preserve">, pulando direto para a escolha do time/jogador.</w:t>
+      </w:r>
+    </w:p>
+    <w:p>
+      <w:r>
+        <w:t xml:space="preserve">•  Reaproveita exatamente o fluxo de conexão da EF Perfil do Atleta (seguir → conectar). O que muda é que a pessoa não precisa mais descobrir os passos sozinha.</w:t>
       </w:r>
     </w:p>
     <w:p>
@@ -320,99 +305,81 @@
         <w:pStyle w:val="Heading3"/>
       </w:pPr>
       <w:r>
-        <w:t>2.2 Fluxo do atleta (logado e anônimo)</w:t>
-      </w:r>
-    </w:p>
-    <w:p>
-      <w:r>
-        <w:rPr>
-          <w:b/>
-        </w:rPr>
-        <w:t>Usuário logado</w:t>
-      </w:r>
-      <w:r>
-        <w:t>, na página pública:</w:t>
-      </w:r>
-    </w:p>
-    <w:p>
-      <w:r>
-        <w:t xml:space="preserve">•  Clica em “Jogo nesta Copa” → o app segue a copa e redireciona para o painel, que </w:t>
-      </w:r>
-      <w:r>
-        <w:rPr>
-          <w:b/>
-        </w:rPr>
-        <w:t>abre o modal “Me conectar à Copa”</w:t>
-      </w:r>
-      <w:r>
-        <w:t xml:space="preserve"> com a competição pré-selecionada e o passo do elenco já carregado.</w:t>
-      </w:r>
-    </w:p>
-    <w:p>
-      <w:r>
-        <w:t xml:space="preserve">•  Se ele </w:t>
-      </w:r>
-      <w:r>
-        <w:rPr>
-          <w:b/>
-        </w:rPr>
-        <w:t>já tem conexão aprovada ou pendente</w:t>
-      </w:r>
-      <w:r>
-        <w:t xml:space="preserve"> naquela copa, o app não abre o modal de novo: leva ao </w:t>
-      </w:r>
-      <w:r>
-        <w:rPr>
-          <w:b/>
-        </w:rPr>
-        <w:t>Painel do Atleta</w:t>
-      </w:r>
-      <w:r>
-        <w:t xml:space="preserve"> (aba “🎽 Sou Atleta”), onde ele vê o estado da sua conexão.</w:t>
-      </w:r>
-    </w:p>
-    <w:p>
-      <w:r>
-        <w:rPr>
-          <w:b/>
-        </w:rPr>
-        <w:t>Visitante anônimo</w:t>
-      </w:r>
-      <w:r>
-        <w:t xml:space="preserve"> (mesmo padrão do “Seguir” — RN-SG-05):</w:t>
-      </w:r>
-    </w:p>
-    <w:p>
-      <w:r>
-        <w:t xml:space="preserve">•  Clica em “Jogo nesta Copa” → o app </w:t>
-      </w:r>
-      <w:r>
-        <w:rPr>
-          <w:b/>
-        </w:rPr>
-        <w:t>guarda a intenção</w:t>
-      </w:r>
-      <w:r>
-        <w:t xml:space="preserve"> (o slug da copa) e leva a pessoa ao login/cadastro.</w:t>
-      </w:r>
-    </w:p>
-    <w:p>
-      <w:r>
-        <w:t xml:space="preserve">•  Após autenticar (senha ou Google), o painel efetiva a intenção: </w:t>
-      </w:r>
-      <w:r>
-        <w:rPr>
-          <w:b/>
-        </w:rPr>
-        <w:t>segue a copa e abre o modal de conexão</w:t>
-      </w:r>
-      <w:r>
-        <w:t xml:space="preserve"> pré-selecionado. Cadastro novo respeita a confirmação de e-mail — a intenção é efetivada no primeiro login válido.</w:t>
-      </w:r>
-    </w:p>
-    <w:p>
-      <w:r>
-        <w:t>•  Intenção antiga (mais de 1 hora) é descartada, igual ao “seguir pendente”, para não abrir um modal que a pessoa já esqueceu.</w:t>
+        <w:t xml:space="preserve">2.2 Os três estados do botão (novidade da v1.1)</w:t>
+      </w:r>
+    </w:p>
+    <w:p>
+      <w:r>
+        <w:t xml:space="preserve">O botão lê o estado da conexão do atleta naquela copa (resolvido no mesmo pedido que já alimentava o botão “Seguir”) e se comporta de três formas:</w:t>
+      </w:r>
+    </w:p>
+    <w:p>
+      <w:r>
+        <w:t xml:space="preserve">•  </w:t>
+      </w:r>
+      <w:r>
+        <w:rPr>
+          <w:b/>
+        </w:rPr>
+        <w:t xml:space="preserve">Sem conexão (ou recusada):</w:t>
+      </w:r>
+      <w:r>
+        <w:t xml:space="preserve"> mostra “🎽 Eu jogo nesta Copa”. Clicar dispara o atalho (segue + abre o modal de conexão).</w:t>
+      </w:r>
+    </w:p>
+    <w:p>
+      <w:r>
+        <w:t xml:space="preserve">•  </w:t>
+      </w:r>
+      <w:r>
+        <w:rPr>
+          <w:b/>
+        </w:rPr>
+        <w:t xml:space="preserve">Solicitação pendente:</w:t>
+      </w:r>
+      <w:r>
+        <w:t xml:space="preserve"> clicar mostra o aviso </w:t>
+      </w:r>
+      <w:r>
+        <w:rPr>
+          <w:b/>
+        </w:rPr>
+        <w:t xml:space="preserve">“Você tem uma solicitação pendente nesta Copa.”</w:t>
+      </w:r>
+      <w:r>
+        <w:t xml:space="preserve"> e não reabre o fluxo (evita pedido duplicado).</w:t>
+      </w:r>
+    </w:p>
+    <w:p>
+      <w:r>
+        <w:t xml:space="preserve">•  </w:t>
+      </w:r>
+      <w:r>
+        <w:rPr>
+          <w:b/>
+        </w:rPr>
+        <w:t xml:space="preserve">Já conectado (aprovada):</w:t>
+      </w:r>
+      <w:r>
+        <w:t xml:space="preserve"> o botão vira </w:t>
+      </w:r>
+      <w:r>
+        <w:rPr>
+          <w:b/>
+        </w:rPr>
+        <w:t xml:space="preserve">“✅ Jogando esta Copa”</w:t>
+      </w:r>
+      <w:r>
+        <w:t xml:space="preserve"> com destaque visual preenchido — o mesmo padrão do “Seguir esta Copa” que vira “★ Seguindo”. Clicar leva o atleta ao painel dele (aba “Sou Atleta”). Nesse estado o botão aparece mesmo que a copa tenha parado de aceitar conexões, porque passa a ser um </w:t>
+      </w:r>
+      <w:r>
+        <w:rPr>
+          <w:b/>
+        </w:rPr>
+        <w:t xml:space="preserve">status</w:t>
+      </w:r>
+      <w:r>
+        <w:t xml:space="preserve">, não um convite.</w:t>
       </w:r>
     </w:p>
     <w:p>
@@ -420,82 +387,85 @@
         <w:pStyle w:val="Heading3"/>
       </w:pPr>
       <w:r>
-        <w:t>2.3 Central de notificações (o sininho)</w:t>
-      </w:r>
-    </w:p>
-    <w:p>
-      <w:r>
-        <w:t xml:space="preserve">•  Um ícone de </w:t>
-      </w:r>
-      <w:r>
-        <w:rPr>
-          <w:b/>
-        </w:rPr>
-        <w:t>sino 🔔 no topo do app</w:t>
-      </w:r>
-      <w:r>
-        <w:t xml:space="preserve"> (barra superior do painel), visível em todas as telas do painel logado.</w:t>
-      </w:r>
-    </w:p>
-    <w:p>
-      <w:r>
-        <w:t xml:space="preserve">•  Quando há novidades, o sino exibe um </w:t>
-      </w:r>
-      <w:r>
-        <w:rPr>
-          <w:b/>
-        </w:rPr>
-        <w:t>contador</w:t>
-      </w:r>
-      <w:r>
-        <w:t xml:space="preserve"> (bolinha com o número de notificações não lidas).</w:t>
-      </w:r>
-    </w:p>
-    <w:p>
-      <w:r>
-        <w:t xml:space="preserve">•  Clicar no sino abre um </w:t>
-      </w:r>
-      <w:r>
-        <w:rPr>
-          <w:b/>
-        </w:rPr>
-        <w:t>dropdown</w:t>
-      </w:r>
-      <w:r>
-        <w:t xml:space="preserve"> com a lista de notificações, da mais recente para a mais antiga. Cada item tem um ícone, um texto curto e leva a uma ação ao ser clicado.</w:t>
-      </w:r>
-    </w:p>
-    <w:p>
-      <w:r>
-        <w:t xml:space="preserve">•  Abrir o dropdown </w:t>
-      </w:r>
-      <w:r>
-        <w:rPr>
-          <w:b/>
-        </w:rPr>
-        <w:t>marca as notificações como lidas</w:t>
-      </w:r>
-      <w:r>
-        <w:t xml:space="preserve"> (zera o contador); os itens continuam na lista enquanto a situação que os gerou existir.</w:t>
-      </w:r>
-    </w:p>
-    <w:p>
-      <w:r>
-        <w:t>•  Sem notificações, o dropdown mostra um estado vazio amigável (ex.: “Tudo em dia por aqui 🎉”).</w:t>
-      </w:r>
-    </w:p>
-    <w:p>
-      <w:r>
-        <w:t xml:space="preserve">No MVP, a central nasce com </w:t>
-      </w:r>
-      <w:r>
-        <w:rPr>
-          <w:b/>
-        </w:rPr>
-        <w:t>um tipo</w:t>
-      </w:r>
-      <w:r>
-        <w:t xml:space="preserve"> de notificação — solicitações de conexão para o gestor (2.4). A arquitetura é genérica para acomodar tipos futuros (conexão aprovada/recusada para o atleta, novos resultados nas copas seguidas etc.), sem retrabalho.</w:t>
+        <w:t xml:space="preserve">2.3 Fluxo do atleta (logado e anônimo)</w:t>
+      </w:r>
+    </w:p>
+    <w:p>
+      <w:r>
+        <w:rPr>
+          <w:b/>
+        </w:rPr>
+        <w:t xml:space="preserve">Usuário logado</w:t>
+      </w:r>
+      <w:r>
+        <w:t xml:space="preserve">, na página pública:</w:t>
+      </w:r>
+    </w:p>
+    <w:p>
+      <w:r>
+        <w:t xml:space="preserve">•  Clica em “Eu jogo nesta Copa” → o app segue a copa e redireciona para o painel, que </w:t>
+      </w:r>
+      <w:r>
+        <w:rPr>
+          <w:b/>
+        </w:rPr>
+        <w:t xml:space="preserve">abre o modal “Me conectar à Copa”</w:t>
+      </w:r>
+      <w:r>
+        <w:t xml:space="preserve"> com a competição pré-selecionada e o passo do elenco já carregado.</w:t>
+      </w:r>
+    </w:p>
+    <w:p>
+      <w:r>
+        <w:t xml:space="preserve">•  Se ele </w:t>
+      </w:r>
+      <w:r>
+        <w:rPr>
+          <w:b/>
+        </w:rPr>
+        <w:t xml:space="preserve">já tem conexão aprovada ou pendente</w:t>
+      </w:r>
+      <w:r>
+        <w:t xml:space="preserve">, o app não reabre o modal: o botão já reflete isso (2.2) e leva ao painel do atleta.</w:t>
+      </w:r>
+    </w:p>
+    <w:p>
+      <w:r>
+        <w:rPr>
+          <w:b/>
+        </w:rPr>
+        <w:t xml:space="preserve">Visitante anônimo</w:t>
+      </w:r>
+      <w:r>
+        <w:t xml:space="preserve"> (mesmo padrão do “Seguir” — RN-SG-05):</w:t>
+      </w:r>
+    </w:p>
+    <w:p>
+      <w:r>
+        <w:t xml:space="preserve">•  Clica → o app </w:t>
+      </w:r>
+      <w:r>
+        <w:rPr>
+          <w:b/>
+        </w:rPr>
+        <w:t xml:space="preserve">guarda a intenção</w:t>
+      </w:r>
+      <w:r>
+        <w:t xml:space="preserve"> (o slug) e leva ao login/cadastro.</w:t>
+      </w:r>
+    </w:p>
+    <w:p>
+      <w:r>
+        <w:t xml:space="preserve">•  Após autenticar (senha ou Google), o painel efetiva a intenção: </w:t>
+      </w:r>
+      <w:r>
+        <w:rPr>
+          <w:b/>
+        </w:rPr>
+        <w:t xml:space="preserve">segue a copa e abre o modal</w:t>
+      </w:r>
+      <w:r>
+        <w:t xml:space="preserve"> pré-selecionado. Cadastro novo respeita a confirmação de e-mail — a intenção é efetivada no primeiro login válido. Intenção com mais de 1 hora é descartada.</w:t>
       </w:r>
     </w:p>
     <w:p>
@@ -503,113 +473,106 @@
         <w:pStyle w:val="Heading3"/>
       </w:pPr>
       <w:r>
-        <w:t>2.4 Notificação de solicitação de conexão (para o gestor)</w:t>
-      </w:r>
-    </w:p>
-    <w:p>
-      <w:r>
-        <w:t xml:space="preserve">•  Quando um atleta solicita conexão a uma copa que a pessoa administra, surge uma notificação no sino do </w:t>
-      </w:r>
-      <w:r>
-        <w:rPr>
-          <w:b/>
-        </w:rPr>
-        <w:t>dono</w:t>
-      </w:r>
-      <w:r>
-        <w:t xml:space="preserve"> daquela copa.</w:t>
-      </w:r>
-    </w:p>
-    <w:p>
-      <w:r>
-        <w:t xml:space="preserve">•  </w:t>
-      </w:r>
-      <w:r>
-        <w:rPr>
-          <w:b/>
-        </w:rPr>
-        <w:t>Solicitações da mesma copa somam numa notificação só</w:t>
-      </w:r>
-      <w:r>
-        <w:t xml:space="preserve">, com contagem — ex.: “Você tem </w:t>
-      </w:r>
-      <w:r>
-        <w:rPr>
-          <w:b/>
-        </w:rPr>
-        <w:t>3 solicitações</w:t>
-      </w:r>
-      <w:r>
-        <w:t xml:space="preserve"> de atletas pendentes na Copa </w:t>
-      </w:r>
-      <w:r>
-        <w:rPr>
-          <w:b/>
-        </w:rPr>
-        <w:t>XPTO</w:t>
-      </w:r>
-      <w:r>
-        <w:t>”. Uma solicitação: “</w:t>
-      </w:r>
-      <w:r>
-        <w:rPr>
-          <w:b/>
-        </w:rPr>
-        <w:t>1 solicitação</w:t>
-      </w:r>
-      <w:r>
-        <w:t xml:space="preserve"> de atleta pendente na Copa XPTO”.</w:t>
-      </w:r>
-    </w:p>
-    <w:p>
-      <w:r>
-        <w:t xml:space="preserve">•  Clicar na notificação leva </w:t>
-      </w:r>
-      <w:r>
-        <w:rPr>
-          <w:b/>
-        </w:rPr>
-        <w:t>direto à aba Atletas daquela competição</w:t>
-      </w:r>
-      <w:r>
-        <w:t>, onde as solicitações pendentes já são listadas (aba dono-only da EF Perfil do Atleta).</w:t>
-      </w:r>
-    </w:p>
-    <w:p>
-      <w:r>
-        <w:t xml:space="preserve">•  A notificação </w:t>
-      </w:r>
-      <w:r>
-        <w:rPr>
-          <w:b/>
-        </w:rPr>
-        <w:t>espelha a realidade</w:t>
-      </w:r>
-      <w:r>
-        <w:t>: se as solicitações forem aprovadas/recusadas (ali ou em lote), ela some sozinha. É derivada das solicitações pendentes, não um registro que precisa ser “apagado”.</w:t>
-      </w:r>
-    </w:p>
-    <w:p>
-      <w:r>
-        <w:t xml:space="preserve">Nota sobre o nome da aba: o pedido inicial mencionava uma guia “Alertas”; a aba onde o gestor avalia conexões, hoje no produto, chama-se </w:t>
-      </w:r>
-      <w:r>
-        <w:rPr>
-          <w:b/>
-        </w:rPr>
-        <w:t>“Atletas”</w:t>
-      </w:r>
-      <w:r>
-        <w:t>. Este documento adota o nome real (</w:t>
-      </w:r>
-      <w:r>
-        <w:rPr>
-          <w:b/>
-        </w:rPr>
-        <w:t>Atletas</w:t>
-      </w:r>
-      <w:r>
-        <w:t>). Renomeá-la para “Alertas” é uma decisão de UI em aberto (seção 7).</w:t>
+        <w:t xml:space="preserve">2.4 Central de notificações (o sininho)</w:t>
+      </w:r>
+    </w:p>
+    <w:p>
+      <w:r>
+        <w:t xml:space="preserve">•  Um ícone de </w:t>
+      </w:r>
+      <w:r>
+        <w:rPr>
+          <w:b/>
+        </w:rPr>
+        <w:t xml:space="preserve">sino 🔔 no topo do app</w:t>
+      </w:r>
+      <w:r>
+        <w:t xml:space="preserve">, visível em todas as telas do painel logado.</w:t>
+      </w:r>
+    </w:p>
+    <w:p>
+      <w:r>
+        <w:t xml:space="preserve">•  Quando há novidades, exibe um </w:t>
+      </w:r>
+      <w:r>
+        <w:rPr>
+          <w:b/>
+        </w:rPr>
+        <w:t xml:space="preserve">contador</w:t>
+      </w:r>
+      <w:r>
+        <w:t xml:space="preserve"> de notificações não lidas.</w:t>
+      </w:r>
+    </w:p>
+    <w:p>
+      <w:r>
+        <w:t xml:space="preserve">•  Clicar abre um </w:t>
+      </w:r>
+      <w:r>
+        <w:rPr>
+          <w:b/>
+        </w:rPr>
+        <w:t xml:space="preserve">dropdown</w:t>
+      </w:r>
+      <w:r>
+        <w:t xml:space="preserve"> com a lista, da mais recente para a mais antiga. Cada item tem ícone, texto curto e leva a uma ação ao ser clicado.</w:t>
+      </w:r>
+    </w:p>
+    <w:p>
+      <w:r>
+        <w:t xml:space="preserve">•  Abrir o dropdown </w:t>
+      </w:r>
+      <w:r>
+        <w:rPr>
+          <w:b/>
+        </w:rPr>
+        <w:t xml:space="preserve">marca as notificações como lidas</w:t>
+      </w:r>
+      <w:r>
+        <w:t xml:space="preserve"> (zera o contador); os itens continuam na lista enquanto a situação que os gerou existir.</w:t>
+      </w:r>
+    </w:p>
+    <w:p>
+      <w:r>
+        <w:t xml:space="preserve">•  Sem notificações, o dropdown mostra um estado vazio: </w:t>
+      </w:r>
+      <w:r>
+        <w:rPr>
+          <w:b/>
+        </w:rPr>
+        <w:t xml:space="preserve">“Tudo em dia por aqui 🎉”</w:t>
+      </w:r>
+      <w:r>
+        <w:t xml:space="preserve">.</w:t>
+      </w:r>
+    </w:p>
+    <w:p>
+      <w:r>
+        <w:rPr>
+          <w:b/>
+        </w:rPr>
+        <w:t xml:space="preserve">Como o contador conta (decisão as-built):</w:t>
+      </w:r>
+      <w:r>
+        <w:t xml:space="preserve"> o número no sino é a quantidade de </w:t>
+      </w:r>
+      <w:r>
+        <w:rPr>
+          <w:b/>
+        </w:rPr>
+        <w:t xml:space="preserve">notificações</w:t>
+      </w:r>
+      <w:r>
+        <w:t xml:space="preserve"> não lidas (uma por copa), não o total de solicitações. Cada item exibe a sua própria contagem (“3 solicitações…”). É o padrão de sino tipo caixa de entrada. No MVP existe </w:t>
+      </w:r>
+      <w:r>
+        <w:rPr>
+          <w:b/>
+        </w:rPr>
+        <w:t xml:space="preserve">um tipo</w:t>
+      </w:r>
+      <w:r>
+        <w:t xml:space="preserve"> de notificação (2.5); a arquitetura é genérica para tipos futuros.</w:t>
       </w:r>
     </w:p>
     <w:p>
@@ -617,8 +580,89 @@
         <w:pStyle w:val="Heading3"/>
       </w:pPr>
       <w:r>
-        <w:lastRenderedPageBreak/>
-        <w:t>2.5 Aprovar todas as solicitações</w:t>
+        <w:t xml:space="preserve">2.5 Notificação de solicitação de conexão (para o gestor)</w:t>
+      </w:r>
+    </w:p>
+    <w:p>
+      <w:r>
+        <w:t xml:space="preserve">•  Quando um atleta solicita conexão a uma copa que a pessoa administra, surge uma notificação no sino do </w:t>
+      </w:r>
+      <w:r>
+        <w:rPr>
+          <w:b/>
+        </w:rPr>
+        <w:t xml:space="preserve">dono</w:t>
+      </w:r>
+      <w:r>
+        <w:t xml:space="preserve"> daquela copa.</w:t>
+      </w:r>
+    </w:p>
+    <w:p>
+      <w:r>
+        <w:t xml:space="preserve">•  </w:t>
+      </w:r>
+      <w:r>
+        <w:rPr>
+          <w:b/>
+        </w:rPr>
+        <w:t xml:space="preserve">Solicitações da mesma copa somam numa notificação só</w:t>
+      </w:r>
+      <w:r>
+        <w:t xml:space="preserve">, com contagem — ex.: “</w:t>
+      </w:r>
+      <w:r>
+        <w:rPr>
+          <w:b/>
+        </w:rPr>
+        <w:t xml:space="preserve">3 solicitações</w:t>
+      </w:r>
+      <w:r>
+        <w:t xml:space="preserve"> de atletas pendentes” na copa X. Uma: “</w:t>
+      </w:r>
+      <w:r>
+        <w:rPr>
+          <w:b/>
+        </w:rPr>
+        <w:t xml:space="preserve">1 solicitação</w:t>
+      </w:r>
+      <w:r>
+        <w:t xml:space="preserve"> de atleta pendente”.</w:t>
+      </w:r>
+    </w:p>
+    <w:p>
+      <w:r>
+        <w:t xml:space="preserve">•  Clicar leva </w:t>
+      </w:r>
+      <w:r>
+        <w:rPr>
+          <w:b/>
+        </w:rPr>
+        <w:t xml:space="preserve">direto à aba Atletas daquela competição</w:t>
+      </w:r>
+      <w:r>
+        <w:t xml:space="preserve">, onde as solicitações pendentes já são listadas (aba dono-only).</w:t>
+      </w:r>
+    </w:p>
+    <w:p>
+      <w:r>
+        <w:t xml:space="preserve">•  A notificação é </w:t>
+      </w:r>
+      <w:r>
+        <w:rPr>
+          <w:b/>
+        </w:rPr>
+        <w:t xml:space="preserve">derivada</w:t>
+      </w:r>
+      <w:r>
+        <w:t xml:space="preserve"> das solicitações pendentes: se forem aprovadas/recusadas (ali ou em lote), ela some sozinha — não é um registro que precisa ser “apagado”.</w:t>
+      </w:r>
+    </w:p>
+    <w:p>
+      <w:pPr>
+        <w:pStyle w:val="Heading3"/>
+      </w:pPr>
+      <w:r>
+        <w:t xml:space="preserve">2.6 Aprovar todas as solicitações</w:t>
       </w:r>
     </w:p>
     <w:p>
@@ -629,30 +673,39 @@
         <w:rPr>
           <w:b/>
         </w:rPr>
-        <w:t>Atletas</w:t>
-      </w:r>
-      <w:r>
-        <w:t xml:space="preserve">, acima da lista de pendentes, um botão </w:t>
-      </w:r>
-      <w:r>
-        <w:rPr>
-          <w:b/>
-        </w:rPr>
-        <w:t>“Aprovar todas (N)”</w:t>
-      </w:r>
-      <w:r>
-        <w:t xml:space="preserve"> aparece quando há duas ou mais solicitações pendentes.</w:t>
-      </w:r>
-    </w:p>
-    <w:p>
-      <w:r>
-        <w:t xml:space="preserve">•  Ao clicar, o app pede uma </w:t>
-      </w:r>
-      <w:r>
-        <w:rPr>
-          <w:b/>
-        </w:rPr>
-        <w:t>confirmação</w:t>
+        <w:t xml:space="preserve">Atletas</w:t>
+      </w:r>
+      <w:r>
+        <w:t xml:space="preserve">, no cabeçalho das solicitações, um botão </w:t>
+      </w:r>
+      <w:r>
+        <w:rPr>
+          <w:b/>
+        </w:rPr>
+        <w:t xml:space="preserve">“Aprovar todas (N)”</w:t>
+      </w:r>
+      <w:r>
+        <w:t xml:space="preserve"> aparece quando há </w:t>
+      </w:r>
+      <w:r>
+        <w:rPr>
+          <w:b/>
+        </w:rPr>
+        <w:t xml:space="preserve">duas ou mais</w:t>
+      </w:r>
+      <w:r>
+        <w:t xml:space="preserve"> pendentes.</w:t>
+      </w:r>
+    </w:p>
+    <w:p>
+      <w:r>
+        <w:t xml:space="preserve">•  Ao clicar, o app </w:t>
+      </w:r>
+      <w:r>
+        <w:rPr>
+          <w:b/>
+        </w:rPr>
+        <w:t xml:space="preserve">pede confirmação</w:t>
       </w:r>
       <w:r>
         <w:t xml:space="preserve"> (“Aprovar as N solicitações pendentes desta copa?”) e então aprova todas de uma vez.</w:t>
@@ -666,7 +719,7 @@
         <w:rPr>
           <w:b/>
         </w:rPr>
-        <w:t>sem nenhum acesso</w:t>
+        <w:t xml:space="preserve">sem nenhum acesso</w:t>
       </w:r>
       <w:r>
         <w:t xml:space="preserve"> de gestão.</w:t>
@@ -674,30 +727,39 @@
     </w:p>
     <w:p>
       <w:r>
-        <w:t>•  Se alguma solicitação já tinha sido resolvida no intervalo (aprovada/recusada em outra aba), ela é simplesmente ignorada — a operação aprova só o que ainda está pendente.</w:t>
-      </w:r>
-    </w:p>
-    <w:p>
-      <w:r>
-        <w:t xml:space="preserve">•  O aviso de entrosamento (⚠️ “este time já tem mais conexões do que a variante sugere”) continua visível </w:t>
-      </w:r>
-      <w:r>
-        <w:rPr>
-          <w:b/>
-        </w:rPr>
-        <w:t>por linha</w:t>
-      </w:r>
-      <w:r>
-        <w:t xml:space="preserve"> antes de aprovar; ao aprovar em lote, a decisão é assumida em conjunto. O gestor sempre pode </w:t>
-      </w:r>
-      <w:r>
-        <w:rPr>
-          <w:b/>
-        </w:rPr>
-        <w:t>revogar</w:t>
-      </w:r>
-      <w:r>
-        <w:t xml:space="preserve"> uma conexão depois.</w:t>
+        <w:t xml:space="preserve">•  </w:t>
+      </w:r>
+      <w:r>
+        <w:rPr>
+          <w:b/>
+        </w:rPr>
+        <w:t xml:space="preserve">Conflito não aborta o lote:</w:t>
+      </w:r>
+      <w:r>
+        <w:t xml:space="preserve"> se duas solicitações disputam o </w:t>
+      </w:r>
+      <w:r>
+        <w:rPr>
+          <w:b/>
+        </w:rPr>
+        <w:t xml:space="preserve">mesmo jogador</w:t>
+      </w:r>
+      <w:r>
+        <w:t xml:space="preserve">, a primeira é aprovada e a outra é </w:t>
+      </w:r>
+      <w:r>
+        <w:rPr>
+          <w:b/>
+        </w:rPr>
+        <w:t xml:space="preserve">ignorada</w:t>
+      </w:r>
+      <w:r>
+        <w:t xml:space="preserve"> (segue pendente para o dono resolver). O app avisa quantas foram aprovadas e quantas ignoradas.</w:t>
+      </w:r>
+    </w:p>
+    <w:p>
+      <w:r>
+        <w:t xml:space="preserve">•  Solicitações já resolvidas no intervalo são simplesmente ignoradas (operação idempotente).</w:t>
       </w:r>
     </w:p>
     <w:p>
@@ -705,7 +767,7 @@
         <w:pStyle w:val="Heading1"/>
       </w:pPr>
       <w:r>
-        <w:t>3. Regras de negócio (RN-NT)</w:t>
+        <w:t xml:space="preserve">3. Regras de negócio (RN-NT)</w:t>
       </w:r>
     </w:p>
     <w:tbl>
@@ -746,7 +808,7 @@
                 <w:color w:val="FFFFFF"/>
                 <w:sz w:val="19"/>
               </w:rPr>
-              <w:t>Código</w:t>
+              <w:t xml:space="preserve">Código</w:t>
             </w:r>
           </w:p>
         </w:tc>
@@ -772,7 +834,7 @@
                 <w:color w:val="FFFFFF"/>
                 <w:sz w:val="19"/>
               </w:rPr>
-              <w:t>Regra</w:t>
+              <w:t xml:space="preserve">Regra (as-built)</w:t>
             </w:r>
           </w:p>
         </w:tc>
@@ -797,7 +859,7 @@
               <w:rPr>
                 <w:sz w:val="19"/>
               </w:rPr>
-              <w:t>RN-NT-01</w:t>
+              <w:t xml:space="preserve">RN-NT-01</w:t>
             </w:r>
           </w:p>
         </w:tc>
@@ -820,7 +882,7 @@
               <w:rPr>
                 <w:sz w:val="19"/>
               </w:rPr>
-              <w:t>O botão “Jogo nesta Copa” aparece na página pública apenas quando o campeonato está publicado E aceita conexões de atletas (aceita_conexoes = 1). Caso contrário, fica oculto.</w:t>
+              <w:t xml:space="preserve">O botão “Eu jogo nesta Copa” aparece na página pública quando o campeonato está publicado E aceita conexões (aceita_conexoes = 1) — OU quando o atleta já está conectado (o botão vira “Jogando esta Copa”). Caso contrário, fica oculto.</w:t>
             </w:r>
           </w:p>
         </w:tc>
@@ -845,7 +907,7 @@
               <w:rPr>
                 <w:sz w:val="19"/>
               </w:rPr>
-              <w:t>RN-NT-02</w:t>
+              <w:t xml:space="preserve">RN-NT-02</w:t>
             </w:r>
           </w:p>
         </w:tc>
@@ -868,7 +930,7 @@
               <w:rPr>
                 <w:sz w:val="19"/>
               </w:rPr>
-              <w:t>Clicar no botão (logado) segue a copa de forma idempotente (reaproveita POST /api/seguir/:slug) e leva ao painel com o modal “Me conectar à Copa” pré-selecionado naquela copa.</w:t>
+              <w:t xml:space="preserve">Clicar no botão (logado, sem conexão) segue a copa de forma idempotente e leva ao painel com o modal “Me conectar à Copa” pré-selecionado naquela copa.</w:t>
             </w:r>
           </w:p>
         </w:tc>
@@ -893,7 +955,7 @@
               <w:rPr>
                 <w:sz w:val="19"/>
               </w:rPr>
-              <w:t>RN-NT-03</w:t>
+              <w:t xml:space="preserve">RN-NT-03</w:t>
             </w:r>
           </w:p>
         </w:tc>
@@ -916,7 +978,7 @@
               <w:rPr>
                 <w:sz w:val="19"/>
               </w:rPr>
-              <w:t>Se a conta já tem conexão pendente ou aprovada naquela copa, o atalho NÃO reabre o modal de solicitação: leva à aba “Sou Atleta” do painel. Uma conexão recusada pode ser refeita (o modal abre normalmente).</w:t>
+              <w:t xml:space="preserve">Estado da conexão do atleta na copa (resolvido em GET /api/seguir/:slug/estado): pendente → clicar mostra o aviso “Você tem uma solicitação pendente nesta Copa.” e não reabre o modal; aprovada → botão vira “Jogando esta Copa” (layout ativo) e leva à aba “Sou Atleta”; recusada/nula → atalho normal.</w:t>
             </w:r>
           </w:p>
         </w:tc>
@@ -941,7 +1003,7 @@
               <w:rPr>
                 <w:sz w:val="19"/>
               </w:rPr>
-              <w:t>RN-NT-04</w:t>
+              <w:t xml:space="preserve">RN-NT-04</w:t>
             </w:r>
           </w:p>
         </w:tc>
@@ -964,7 +1026,7 @@
               <w:rPr>
                 <w:sz w:val="19"/>
               </w:rPr>
-              <w:t>Visitante anônimo que clica no botão tem a intenção guardada e é levado ao login; após autenticar, a intenção é efetivada (segue + abre o modal). Cadastro novo efetiva no primeiro login válido após confirmar o e-mail. Intenção com mais de 1 hora é descartada.</w:t>
+              <w:t xml:space="preserve">Visitante anônimo que clica tem a intenção guardada (localStorage, TTL 1h) e é levado ao login; após autenticar, a intenção é efetivada (segue + abre o modal). Cadastro novo efetiva no primeiro login válido após confirmar o e-mail.</w:t>
             </w:r>
           </w:p>
         </w:tc>
@@ -989,7 +1051,7 @@
               <w:rPr>
                 <w:sz w:val="19"/>
               </w:rPr>
-              <w:t>RN-NT-05</w:t>
+              <w:t xml:space="preserve">RN-NT-05</w:t>
             </w:r>
           </w:p>
         </w:tc>
@@ -1012,7 +1074,7 @@
               <w:rPr>
                 <w:sz w:val="19"/>
               </w:rPr>
-              <w:t>A central de notificações mostra apenas notificações da própria conta logada. Nenhuma notificação de uma conta é visível para outra.</w:t>
+              <w:t xml:space="preserve">A central de notificações mostra apenas notificações da própria conta logada; a montagem no servidor parte sempre da sessão.</w:t>
             </w:r>
           </w:p>
         </w:tc>
@@ -1037,7 +1099,7 @@
               <w:rPr>
                 <w:sz w:val="19"/>
               </w:rPr>
-              <w:t>RN-NT-06</w:t>
+              <w:t xml:space="preserve">RN-NT-06</w:t>
             </w:r>
           </w:p>
         </w:tc>
@@ -1060,7 +1122,7 @@
               <w:rPr>
                 <w:sz w:val="19"/>
               </w:rPr>
-              <w:t>Para cada copa que a conta administra (dono), as solicitações de conexão PENDENTES são agrupadas em UMA notificação por copa, com a contagem. Zero pendentes = nenhuma notificação daquela copa.</w:t>
+              <w:t xml:space="preserve">Para cada copa que a conta administra (dono), as solicitações PENDENTES são agrupadas em UMA notificação por copa, com a contagem. Zero pendentes = nenhuma notificação daquela copa.</w:t>
             </w:r>
           </w:p>
         </w:tc>
@@ -1085,7 +1147,7 @@
               <w:rPr>
                 <w:sz w:val="19"/>
               </w:rPr>
-              <w:t>RN-NT-07</w:t>
+              <w:t xml:space="preserve">RN-NT-07</w:t>
             </w:r>
           </w:p>
         </w:tc>
@@ -1108,7 +1170,7 @@
               <w:rPr>
                 <w:sz w:val="19"/>
               </w:rPr>
-              <w:t>Clicar na notificação de conexão abre a competição na aba Atletas. O destino exige que a conta seja dona da copa (a aba Atletas é dono-only, conforme a EF Perfil do Atleta).</w:t>
+              <w:t xml:space="preserve">Clicar na notificação de conexão abre a competição na aba Atletas (dono-only, conforme a EF Perfil do Atleta).</w:t>
             </w:r>
           </w:p>
         </w:tc>
@@ -1133,7 +1195,7 @@
               <w:rPr>
                 <w:sz w:val="19"/>
               </w:rPr>
-              <w:t>RN-NT-08</w:t>
+              <w:t xml:space="preserve">RN-NT-08</w:t>
             </w:r>
           </w:p>
         </w:tc>
@@ -1156,7 +1218,7 @@
               <w:rPr>
                 <w:sz w:val="19"/>
               </w:rPr>
-              <w:t>As notificações de conexão são DERIVADAS do estado atual das solicitações pendentes (COUNT por copa), nunca um registro armazenado que precise ser apagado. Resolver as solicitações faz a notificação desaparecer.</w:t>
+              <w:t xml:space="preserve">As notificações de conexão são DERIVADAS do estado atual das solicitações pendentes (COUNT por copa), nunca um registro armazenado. Resolver as solicitações faz a notificação desaparecer.</w:t>
             </w:r>
           </w:p>
         </w:tc>
@@ -1181,7 +1243,7 @@
               <w:rPr>
                 <w:sz w:val="19"/>
               </w:rPr>
-              <w:t>RN-NT-09</w:t>
+              <w:t xml:space="preserve">RN-NT-09</w:t>
             </w:r>
           </w:p>
         </w:tc>
@@ -1204,7 +1266,7 @@
               <w:rPr>
                 <w:sz w:val="19"/>
               </w:rPr>
-              <w:t>O contador de não lidas é a diferença entre as notificações atuais e o marcador “visto por último” da conta. Abrir o dropdown atualiza esse marcador (zera o contador); os itens permanecem enquanto pendentes.</w:t>
+              <w:t xml:space="preserve">O estado de “lido” é do cliente (localStorage cm_notif_visto = data da solicitação mais nova já exibida). O contador do sino é o número de notificações (copas) cujo “atualizado_em” é mais novo que esse marcador. Abrir o dropdown atualiza o marcador (zera o contador); os itens permanecem enquanto pendentes.</w:t>
             </w:r>
           </w:p>
         </w:tc>
@@ -1229,7 +1291,7 @@
               <w:rPr>
                 <w:sz w:val="19"/>
               </w:rPr>
-              <w:t>RN-NT-10</w:t>
+              <w:t xml:space="preserve">RN-NT-10</w:t>
             </w:r>
           </w:p>
         </w:tc>
@@ -1252,7 +1314,7 @@
               <w:rPr>
                 <w:sz w:val="19"/>
               </w:rPr>
-              <w:t>“Aprovar todas” aprova apenas as solicitações que ainda estão pendentes na copa no momento da ação, de forma idempotente. Solicitações já resolvidas são ignoradas sem erro.</w:t>
+              <w:t xml:space="preserve">“Aprovar todas” aprova apenas as pendentes no momento da ação, de forma idempotente. Um conflito (dois pedidos pro mesmo jogador) não aborta o lote: aprova o resto e devolve a contagem de ignoradas. Solicitações já resolvidas são ignoradas sem erro.</w:t>
             </w:r>
           </w:p>
         </w:tc>
@@ -1277,7 +1339,7 @@
               <w:rPr>
                 <w:sz w:val="19"/>
               </w:rPr>
-              <w:t>RN-NT-11</w:t>
+              <w:t xml:space="preserve">RN-NT-11</w:t>
             </w:r>
           </w:p>
         </w:tc>
@@ -1300,7 +1362,7 @@
               <w:rPr>
                 <w:sz w:val="19"/>
               </w:rPr>
-              <w:t>Aprovar (em lote ou individual) segue todas as regras de conexão já vigentes (RN-AT): não concede acesso de gestão, respeita a exclusividade do jogador reivindicado, e a conexão pode ser revogada depois pelo dono.</w:t>
+              <w:t xml:space="preserve">Aprovar (em lote ou individual) segue todas as regras de conexão vigentes (RN-AT): não concede acesso de gestão, respeita a exclusividade do jogador reivindicado, congela em copa encerrada, e a conexão pode ser revogada depois pelo dono.</w:t>
             </w:r>
           </w:p>
         </w:tc>
@@ -1325,7 +1387,7 @@
               <w:rPr>
                 <w:sz w:val="19"/>
               </w:rPr>
-              <w:t>RN-NT-12</w:t>
+              <w:t xml:space="preserve">RN-NT-12</w:t>
             </w:r>
           </w:p>
         </w:tc>
@@ -1348,14 +1410,7 @@
               <w:rPr>
                 <w:sz w:val="19"/>
               </w:rPr>
-              <w:t xml:space="preserve">Apenas o dono da copa recebe a notificação e pode aprovar/aprovar todas, no MVP. Estender a </w:t>
-            </w:r>
-            <w:r>
-              <w:rPr>
-                <w:sz w:val="19"/>
-              </w:rPr>
-              <w:lastRenderedPageBreak/>
-              <w:t>colaboradores com acesso é decisão futura (seção 7).</w:t>
+              <w:t xml:space="preserve">Apenas o dono da copa recebe a notificação e pode aprovar/aprovar todas. A aba Atletas e a decisão de conexão são dono-only.</w:t>
             </w:r>
           </w:p>
         </w:tc>
@@ -1366,38 +1421,27 @@
         <w:pStyle w:val="Heading1"/>
       </w:pPr>
       <w:r>
-        <w:lastRenderedPageBreak/>
-        <w:t>4. Modelo de dados e API</w:t>
-      </w:r>
-    </w:p>
-    <w:p>
-      <w:r>
-        <w:rPr>
-          <w:b/>
-        </w:rPr>
-        <w:t>Sem novas tabelas no MVP.</w:t>
-      </w:r>
-      <w:r>
-        <w:t xml:space="preserve"> As notificações de conexão são calculadas a partir das solicitações pendentes que já existem em `conexoes_atleta` (status = "pendente"), agrupadas por campeonato do qual a conta é dona. O único estado novo é o </w:t>
-      </w:r>
-      <w:r>
-        <w:rPr>
-          <w:b/>
-        </w:rPr>
-        <w:t>marcador de “visto por último”</w:t>
-      </w:r>
-      <w:r>
-        <w:t xml:space="preserve"> para o contador de não lidas.</w:t>
-      </w:r>
-    </w:p>
-    <w:p>
-      <w:r>
-        <w:t>•  Marcador de leitura: um campo leve por conta — `contas.notificacoes_vistas_em` (datetime, aditivo) — atualizado quando a pessoa abre o dropdown. Alternativa mais simples para o MVP: guardar o “visto por último” no `localStorage` do navegador (ver seção 7).</w:t>
-      </w:r>
-    </w:p>
-    <w:p>
-      <w:r>
-        <w:t>•  Nenhuma migração destrutiva. Se optarmos pela coluna, ela é criada no boot como as demais colunas aditivas do produto.</w:t>
+        <w:t xml:space="preserve">4. Modelo de dados e API (as-built)</w:t>
+      </w:r>
+    </w:p>
+    <w:p>
+      <w:r>
+        <w:rPr>
+          <w:b/>
+        </w:rPr>
+        <w:t xml:space="preserve">Nenhuma tabela nova e nenhuma migração.</w:t>
+      </w:r>
+      <w:r>
+        <w:t xml:space="preserve"> As notificações de conexão são calculadas a partir das solicitações pendentes que já existem em `conexoes_atleta` (status = "pendente"), agrupadas por campeonato do qual a conta é dona. O estado de “lido” vive </w:t>
+      </w:r>
+      <w:r>
+        <w:rPr>
+          <w:b/>
+        </w:rPr>
+        <w:t xml:space="preserve">inteiramente no cliente</w:t>
+      </w:r>
+      <w:r>
+        <w:t xml:space="preserve"> (localStorage), então não há coluna nem rota de “marcar como lido”.</w:t>
       </w:r>
     </w:p>
     <w:p/>
@@ -1413,13 +1457,13 @@
         <w:tblLook w:val="04A0" w:firstRow="1" w:lastRow="0" w:firstColumn="1" w:lastColumn="0" w:noHBand="0" w:noVBand="1"/>
       </w:tblPr>
       <w:tblGrid>
-        <w:gridCol w:w="3400"/>
-        <w:gridCol w:w="5950"/>
+        <w:gridCol w:w="3600"/>
+        <w:gridCol w:w="5750"/>
       </w:tblGrid>
       <w:tr>
         <w:tc>
           <w:tcPr>
-            <w:tcW w:w="3400" w:type="dxa"/>
+            <w:tcW w:w="3600" w:type="dxa"/>
             <w:tcBorders>
               <w:top w:val="single" w:sz="4" w:space="0" w:color="CCCCCC"/>
               <w:left w:val="single" w:sz="4" w:space="0" w:color="CCCCCC"/>
@@ -1439,13 +1483,13 @@
                 <w:color w:val="FFFFFF"/>
                 <w:sz w:val="19"/>
               </w:rPr>
-              <w:t>Método e rota</w:t>
-            </w:r>
-          </w:p>
-        </w:tc>
-        <w:tc>
-          <w:tcPr>
-            <w:tcW w:w="5950" w:type="dxa"/>
+              <w:t xml:space="preserve">Método e rota</w:t>
+            </w:r>
+          </w:p>
+        </w:tc>
+        <w:tc>
+          <w:tcPr>
+            <w:tcW w:w="5750" w:type="dxa"/>
             <w:tcBorders>
               <w:top w:val="single" w:sz="4" w:space="0" w:color="CCCCCC"/>
               <w:left w:val="single" w:sz="4" w:space="0" w:color="CCCCCC"/>
@@ -1465,7 +1509,7 @@
                 <w:color w:val="FFFFFF"/>
                 <w:sz w:val="19"/>
               </w:rPr>
-              <w:t>Função</w:t>
+              <w:t xml:space="preserve">Função</w:t>
             </w:r>
           </w:p>
         </w:tc>
@@ -1473,47 +1517,47 @@
       <w:tr>
         <w:tc>
           <w:tcPr>
-            <w:tcW w:w="3400" w:type="dxa"/>
-            <w:tcBorders>
-              <w:top w:val="single" w:sz="4" w:space="0" w:color="CCCCCC"/>
-              <w:left w:val="single" w:sz="4" w:space="0" w:color="CCCCCC"/>
-              <w:bottom w:val="single" w:sz="4" w:space="0" w:color="CCCCCC"/>
-              <w:right w:val="single" w:sz="4" w:space="0" w:color="CCCCCC"/>
-            </w:tcBorders>
-            <w:vAlign w:val="center"/>
-          </w:tcPr>
-          <w:p>
-            <w:pPr>
-              <w:spacing w:before="40" w:after="40"/>
-            </w:pPr>
-            <w:r>
-              <w:rPr>
-                <w:sz w:val="19"/>
-              </w:rPr>
-              <w:t>GET /api/notificacoes</w:t>
-            </w:r>
-          </w:p>
-        </w:tc>
-        <w:tc>
-          <w:tcPr>
-            <w:tcW w:w="5950" w:type="dxa"/>
-            <w:tcBorders>
-              <w:top w:val="single" w:sz="4" w:space="0" w:color="CCCCCC"/>
-              <w:left w:val="single" w:sz="4" w:space="0" w:color="CCCCCC"/>
-              <w:bottom w:val="single" w:sz="4" w:space="0" w:color="CCCCCC"/>
-              <w:right w:val="single" w:sz="4" w:space="0" w:color="CCCCCC"/>
-            </w:tcBorders>
-            <w:vAlign w:val="center"/>
-          </w:tcPr>
-          <w:p>
-            <w:pPr>
-              <w:spacing w:before="40" w:after="40"/>
-            </w:pPr>
-            <w:r>
-              <w:rPr>
-                <w:sz w:val="19"/>
-              </w:rPr>
-              <w:t>Retorna as notificações da conta logada e a contagem de não lidas: { itens: [ { tipo, titulo, texto, contagem, alvo } ], nao_lidas: N }. No MVP, itens = uma entrada por copa do dono com solicitações pendentes.</w:t>
+            <w:tcW w:w="3600" w:type="dxa"/>
+            <w:tcBorders>
+              <w:top w:val="single" w:sz="4" w:space="0" w:color="CCCCCC"/>
+              <w:left w:val="single" w:sz="4" w:space="0" w:color="CCCCCC"/>
+              <w:bottom w:val="single" w:sz="4" w:space="0" w:color="CCCCCC"/>
+              <w:right w:val="single" w:sz="4" w:space="0" w:color="CCCCCC"/>
+            </w:tcBorders>
+            <w:vAlign w:val="center"/>
+          </w:tcPr>
+          <w:p>
+            <w:pPr>
+              <w:spacing w:before="40" w:after="40"/>
+            </w:pPr>
+            <w:r>
+              <w:rPr>
+                <w:sz w:val="19"/>
+              </w:rPr>
+              <w:t xml:space="preserve">GET /api/notificacoes</w:t>
+            </w:r>
+          </w:p>
+        </w:tc>
+        <w:tc>
+          <w:tcPr>
+            <w:tcW w:w="5750" w:type="dxa"/>
+            <w:tcBorders>
+              <w:top w:val="single" w:sz="4" w:space="0" w:color="CCCCCC"/>
+              <w:left w:val="single" w:sz="4" w:space="0" w:color="CCCCCC"/>
+              <w:bottom w:val="single" w:sz="4" w:space="0" w:color="CCCCCC"/>
+              <w:right w:val="single" w:sz="4" w:space="0" w:color="CCCCCC"/>
+            </w:tcBorders>
+            <w:vAlign w:val="center"/>
+          </w:tcPr>
+          <w:p>
+            <w:pPr>
+              <w:spacing w:before="40" w:after="40"/>
+            </w:pPr>
+            <w:r>
+              <w:rPr>
+                <w:sz w:val="19"/>
+              </w:rPr>
+              <w:t xml:space="preserve">Notificações da conta logada: { itens: [ { tipo, campeonato_id, titulo, temporada, contagem, atualizado_em, texto } ] }. No MVP, uma entrada por copa do dono com solicitações pendentes. src/notificacoes.js.</w:t>
             </w:r>
           </w:p>
         </w:tc>
@@ -1521,47 +1565,47 @@
       <w:tr>
         <w:tc>
           <w:tcPr>
-            <w:tcW w:w="3400" w:type="dxa"/>
-            <w:tcBorders>
-              <w:top w:val="single" w:sz="4" w:space="0" w:color="CCCCCC"/>
-              <w:left w:val="single" w:sz="4" w:space="0" w:color="CCCCCC"/>
-              <w:bottom w:val="single" w:sz="4" w:space="0" w:color="CCCCCC"/>
-              <w:right w:val="single" w:sz="4" w:space="0" w:color="CCCCCC"/>
-            </w:tcBorders>
-            <w:vAlign w:val="center"/>
-          </w:tcPr>
-          <w:p>
-            <w:pPr>
-              <w:spacing w:before="40" w:after="40"/>
-            </w:pPr>
-            <w:r>
-              <w:rPr>
-                <w:sz w:val="19"/>
-              </w:rPr>
-              <w:t>POST /api/notificacoes/visto</w:t>
-            </w:r>
-          </w:p>
-        </w:tc>
-        <w:tc>
-          <w:tcPr>
-            <w:tcW w:w="5950" w:type="dxa"/>
-            <w:tcBorders>
-              <w:top w:val="single" w:sz="4" w:space="0" w:color="CCCCCC"/>
-              <w:left w:val="single" w:sz="4" w:space="0" w:color="CCCCCC"/>
-              <w:bottom w:val="single" w:sz="4" w:space="0" w:color="CCCCCC"/>
-              <w:right w:val="single" w:sz="4" w:space="0" w:color="CCCCCC"/>
-            </w:tcBorders>
-            <w:vAlign w:val="center"/>
-          </w:tcPr>
-          <w:p>
-            <w:pPr>
-              <w:spacing w:before="40" w:after="40"/>
-            </w:pPr>
-            <w:r>
-              <w:rPr>
-                <w:sz w:val="19"/>
-              </w:rPr>
-              <w:t>Marca as notificações como lidas (atualiza o marcador “visto por último” da conta / ou é resolvido no cliente via localStorage). Zera o contador.</w:t>
+            <w:tcW w:w="3600" w:type="dxa"/>
+            <w:tcBorders>
+              <w:top w:val="single" w:sz="4" w:space="0" w:color="CCCCCC"/>
+              <w:left w:val="single" w:sz="4" w:space="0" w:color="CCCCCC"/>
+              <w:bottom w:val="single" w:sz="4" w:space="0" w:color="CCCCCC"/>
+              <w:right w:val="single" w:sz="4" w:space="0" w:color="CCCCCC"/>
+            </w:tcBorders>
+            <w:vAlign w:val="center"/>
+          </w:tcPr>
+          <w:p>
+            <w:pPr>
+              <w:spacing w:before="40" w:after="40"/>
+            </w:pPr>
+            <w:r>
+              <w:rPr>
+                <w:sz w:val="19"/>
+              </w:rPr>
+              <w:t xml:space="preserve">POST /api/campeonatos/:id/conexoes/aprovar-todas</w:t>
+            </w:r>
+          </w:p>
+        </w:tc>
+        <w:tc>
+          <w:tcPr>
+            <w:tcW w:w="5750" w:type="dxa"/>
+            <w:tcBorders>
+              <w:top w:val="single" w:sz="4" w:space="0" w:color="CCCCCC"/>
+              <w:left w:val="single" w:sz="4" w:space="0" w:color="CCCCCC"/>
+              <w:bottom w:val="single" w:sz="4" w:space="0" w:color="CCCCCC"/>
+              <w:right w:val="single" w:sz="4" w:space="0" w:color="CCCCCC"/>
+            </w:tcBorders>
+            <w:vAlign w:val="center"/>
+          </w:tcPr>
+          <w:p>
+            <w:pPr>
+              <w:spacing w:before="40" w:after="40"/>
+            </w:pPr>
+            <w:r>
+              <w:rPr>
+                <w:sz w:val="19"/>
+              </w:rPr>
+              <w:t xml:space="preserve">Aprova todas as pendentes daquela copa (dono-only, idempotente). Retorna { aprovadas, ignoradas }. src/conexoes.js → aprovarTodasConexoes (reusa decidirConexao).</w:t>
             </w:r>
           </w:p>
         </w:tc>
@@ -1569,47 +1613,95 @@
       <w:tr>
         <w:tc>
           <w:tcPr>
-            <w:tcW w:w="3400" w:type="dxa"/>
-            <w:tcBorders>
-              <w:top w:val="single" w:sz="4" w:space="0" w:color="CCCCCC"/>
-              <w:left w:val="single" w:sz="4" w:space="0" w:color="CCCCCC"/>
-              <w:bottom w:val="single" w:sz="4" w:space="0" w:color="CCCCCC"/>
-              <w:right w:val="single" w:sz="4" w:space="0" w:color="CCCCCC"/>
-            </w:tcBorders>
-            <w:vAlign w:val="center"/>
-          </w:tcPr>
-          <w:p>
-            <w:pPr>
-              <w:spacing w:before="40" w:after="40"/>
-            </w:pPr>
-            <w:r>
-              <w:rPr>
-                <w:sz w:val="19"/>
-              </w:rPr>
-              <w:t>POST /api/campeonatos/:id/conexoes/aprovar-todas</w:t>
-            </w:r>
-          </w:p>
-        </w:tc>
-        <w:tc>
-          <w:tcPr>
-            <w:tcW w:w="5950" w:type="dxa"/>
-            <w:tcBorders>
-              <w:top w:val="single" w:sz="4" w:space="0" w:color="CCCCCC"/>
-              <w:left w:val="single" w:sz="4" w:space="0" w:color="CCCCCC"/>
-              <w:bottom w:val="single" w:sz="4" w:space="0" w:color="CCCCCC"/>
-              <w:right w:val="single" w:sz="4" w:space="0" w:color="CCCCCC"/>
-            </w:tcBorders>
-            <w:vAlign w:val="center"/>
-          </w:tcPr>
-          <w:p>
-            <w:pPr>
-              <w:spacing w:before="40" w:after="40"/>
-            </w:pPr>
-            <w:r>
-              <w:rPr>
-                <w:sz w:val="19"/>
-              </w:rPr>
-              <w:t>Aprova, de uma vez, todas as solicitações pendentes daquela copa (idempotente; só o dono). Retorna { aprovadas: N }.</w:t>
+            <w:tcW w:w="3600" w:type="dxa"/>
+            <w:tcBorders>
+              <w:top w:val="single" w:sz="4" w:space="0" w:color="CCCCCC"/>
+              <w:left w:val="single" w:sz="4" w:space="0" w:color="CCCCCC"/>
+              <w:bottom w:val="single" w:sz="4" w:space="0" w:color="CCCCCC"/>
+              <w:right w:val="single" w:sz="4" w:space="0" w:color="CCCCCC"/>
+            </w:tcBorders>
+            <w:vAlign w:val="center"/>
+          </w:tcPr>
+          <w:p>
+            <w:pPr>
+              <w:spacing w:before="40" w:after="40"/>
+            </w:pPr>
+            <w:r>
+              <w:rPr>
+                <w:sz w:val="19"/>
+              </w:rPr>
+              <w:t xml:space="preserve">GET /api/seguir/:slug/estado</w:t>
+            </w:r>
+          </w:p>
+        </w:tc>
+        <w:tc>
+          <w:tcPr>
+            <w:tcW w:w="5750" w:type="dxa"/>
+            <w:tcBorders>
+              <w:top w:val="single" w:sz="4" w:space="0" w:color="CCCCCC"/>
+              <w:left w:val="single" w:sz="4" w:space="0" w:color="CCCCCC"/>
+              <w:bottom w:val="single" w:sz="4" w:space="0" w:color="CCCCCC"/>
+              <w:right w:val="single" w:sz="4" w:space="0" w:color="CCCCCC"/>
+            </w:tcBorders>
+            <w:vAlign w:val="center"/>
+          </w:tcPr>
+          <w:p>
+            <w:pPr>
+              <w:spacing w:before="40" w:after="40"/>
+            </w:pPr>
+            <w:r>
+              <w:rPr>
+                <w:sz w:val="19"/>
+              </w:rPr>
+              <w:t xml:space="preserve">Passou a incluir o campo conexao (null | pendente | aprovada | recusada) além de { logado, seguindo } — alimenta os três estados do botão. src/seguidores.js.</w:t>
+            </w:r>
+          </w:p>
+        </w:tc>
+      </w:tr>
+      <w:tr>
+        <w:tc>
+          <w:tcPr>
+            <w:tcW w:w="3600" w:type="dxa"/>
+            <w:tcBorders>
+              <w:top w:val="single" w:sz="4" w:space="0" w:color="CCCCCC"/>
+              <w:left w:val="single" w:sz="4" w:space="0" w:color="CCCCCC"/>
+              <w:bottom w:val="single" w:sz="4" w:space="0" w:color="CCCCCC"/>
+              <w:right w:val="single" w:sz="4" w:space="0" w:color="CCCCCC"/>
+            </w:tcBorders>
+            <w:vAlign w:val="center"/>
+          </w:tcPr>
+          <w:p>
+            <w:pPr>
+              <w:spacing w:before="40" w:after="40"/>
+            </w:pPr>
+            <w:r>
+              <w:rPr>
+                <w:sz w:val="19"/>
+              </w:rPr>
+              <w:t xml:space="preserve">GET /api/publico/:slug</w:t>
+            </w:r>
+          </w:p>
+        </w:tc>
+        <w:tc>
+          <w:tcPr>
+            <w:tcW w:w="5750" w:type="dxa"/>
+            <w:tcBorders>
+              <w:top w:val="single" w:sz="4" w:space="0" w:color="CCCCCC"/>
+              <w:left w:val="single" w:sz="4" w:space="0" w:color="CCCCCC"/>
+              <w:bottom w:val="single" w:sz="4" w:space="0" w:color="CCCCCC"/>
+              <w:right w:val="single" w:sz="4" w:space="0" w:color="CCCCCC"/>
+            </w:tcBorders>
+            <w:vAlign w:val="center"/>
+          </w:tcPr>
+          <w:p>
+            <w:pPr>
+              <w:spacing w:before="40" w:after="40"/>
+            </w:pPr>
+            <w:r>
+              <w:rPr>
+                <w:sz w:val="19"/>
+              </w:rPr>
+              <w:t xml:space="preserve">Passou a incluir campeonato.aceita_conexoes — o cliente decide se mostra o botão. src/publico.js.</w:t>
             </w:r>
           </w:p>
         </w:tc>
@@ -1617,12 +1709,7 @@
     </w:tbl>
     <w:p>
       <w:r>
-        <w:t>As rotas de notificação usam o middleware `logado`; a rota de aprovar-todas usa a mesma validação de posse (dono da copa) já aplicada ao decidir conexão individual. A lógica de conexão vive em `src/conexoes.js` (nova função `aprovarTodasConexoes`); a montagem das notificações, em um pequeno `src/notificacoes.js`.</w:t>
-      </w:r>
-    </w:p>
-    <w:p>
-      <w:r>
-        <w:t>No cliente, o atalho da página pública reaproveita o padrão de “intenção pendente” já usado pelo Seguir: uma chave em `localStorage` (ex.: `cm_conectar_pendente = { slug, em }`), lida no boot do painel — espelhando `executarSeguirPendente()` do `admin.html`.</w:t>
+        <w:t xml:space="preserve">Não há POST /api/notificacoes/visto (proposto na v1.0): o “lido” é resolvido no cliente. No cliente, o atalho reaproveita o padrão de “intenção pendente” do Seguir (localStorage cm_conectar_pendente { slug, em }), lido no boot do painel — espelhando executarSeguirPendente(). O sino usa localStorage cm_notif_visto.</w:t>
       </w:r>
     </w:p>
     <w:p>
@@ -1630,7 +1717,7 @@
         <w:pStyle w:val="Heading1"/>
       </w:pPr>
       <w:r>
-        <w:t>5. Segurança e privacidade</w:t>
+        <w:t xml:space="preserve">5. Segurança e privacidade</w:t>
       </w:r>
     </w:p>
     <w:p>
@@ -1641,10 +1728,10 @@
         <w:rPr>
           <w:b/>
         </w:rPr>
-        <w:t>Isolamento:</w:t>
-      </w:r>
-      <w:r>
-        <w:t xml:space="preserve"> a central só mostra notificações da própria conta; a montagem no servidor parte sempre da sessão logada, nunca de um id vindo do cliente.</w:t>
+        <w:t xml:space="preserve">Isolamento:</w:t>
+      </w:r>
+      <w:r>
+        <w:t xml:space="preserve"> a central só mostra notificações da própria conta; a montagem no servidor parte sempre da sessão logada.</w:t>
       </w:r>
     </w:p>
     <w:p>
@@ -1655,10 +1742,10 @@
         <w:rPr>
           <w:b/>
         </w:rPr>
-        <w:t>Posse preservada:</w:t>
-      </w:r>
-      <w:r>
-        <w:t xml:space="preserve"> clicar na notificação e “aprovar todas” exigem ser dono da copa — a aba Atletas e a decisão de conexão já são dono-only. Nenhuma escalada de privilégio é introduzida.</w:t>
+        <w:t xml:space="preserve">Posse preservada:</w:t>
+      </w:r>
+      <w:r>
+        <w:t xml:space="preserve"> clicar na notificação e “aprovar todas” exigem ser dono da copa. Nenhuma escalada de privilégio foi introduzida.</w:t>
       </w:r>
     </w:p>
     <w:p>
@@ -1669,28 +1756,10 @@
         <w:rPr>
           <w:b/>
         </w:rPr>
-        <w:t>E-mail do atleta:</w:t>
-      </w:r>
-      <w:r>
-        <w:t xml:space="preserve"> continua exibido conforme a EF Perfil do Atleta (na aba Atletas, para o dono avaliar). A notificação em si mostra só a </w:t>
-      </w:r>
-      <w:r>
-        <w:rPr>
-          <w:b/>
-        </w:rPr>
-        <w:t>contagem</w:t>
-      </w:r>
-      <w:r>
-        <w:t xml:space="preserve"> e o </w:t>
-      </w:r>
-      <w:r>
-        <w:rPr>
-          <w:b/>
-        </w:rPr>
-        <w:t>nome da copa</w:t>
-      </w:r>
-      <w:r>
-        <w:t>, não dados dos solicitantes.</w:t>
+        <w:t xml:space="preserve">Dados dos solicitantes:</w:t>
+      </w:r>
+      <w:r>
+        <w:t xml:space="preserve"> a notificação mostra só a contagem e o nome da copa. O e-mail do atleta segue mascarado na aba Atletas, para o dono avaliar (EF Perfil do Atleta).</w:t>
       </w:r>
     </w:p>
     <w:p>
@@ -1701,10 +1770,10 @@
         <w:rPr>
           <w:b/>
         </w:rPr>
-        <w:t>Abuso:</w:t>
-      </w:r>
-      <w:r>
-        <w:t xml:space="preserve"> o atalho apenas encadeia ações que já têm rate limit (seguir) e validação (conexão). Manter o rate limit do POST de seguir e da criação de conexão.</w:t>
+        <w:t xml:space="preserve">Abuso:</w:t>
+      </w:r>
+      <w:r>
+        <w:t xml:space="preserve"> o atalho encadeia ações que já têm rate limit (seguir) e validação (conexão).</w:t>
       </w:r>
     </w:p>
     <w:p>
@@ -1715,10 +1784,10 @@
         <w:rPr>
           <w:b/>
         </w:rPr>
-        <w:t>LGPD:</w:t>
-      </w:r>
-      <w:r>
-        <w:t xml:space="preserve"> nada de novo é persistido sobre terceiros. O marcador de leitura (se via coluna) é dado da própria conta, apagado no cascade da exclusão de conta.</w:t>
+        <w:t xml:space="preserve">LGPD:</w:t>
+      </w:r>
+      <w:r>
+        <w:t xml:space="preserve"> nada novo é persistido. O marcador de leitura vive no navegador do próprio usuário.</w:t>
       </w:r>
     </w:p>
     <w:p>
@@ -1726,8 +1795,7 @@
         <w:pStyle w:val="Heading1"/>
       </w:pPr>
       <w:r>
-        <w:lastRenderedPageBreak/>
-        <w:t>6. Fases de implementação</w:t>
+        <w:t xml:space="preserve">6. Fases de implementação (todas em produção)</w:t>
       </w:r>
     </w:p>
     <w:tbl>
@@ -1769,7 +1837,7 @@
                 <w:color w:val="FFFFFF"/>
                 <w:sz w:val="19"/>
               </w:rPr>
-              <w:t>Fase</w:t>
+              <w:t xml:space="preserve">Fase</w:t>
             </w:r>
           </w:p>
         </w:tc>
@@ -1795,7 +1863,7 @@
                 <w:color w:val="FFFFFF"/>
                 <w:sz w:val="19"/>
               </w:rPr>
-              <w:t>Entrega</w:t>
+              <w:t xml:space="preserve">Entrega</w:t>
             </w:r>
           </w:p>
         </w:tc>
@@ -1821,7 +1889,7 @@
                 <w:color w:val="FFFFFF"/>
                 <w:sz w:val="19"/>
               </w:rPr>
-              <w:t>Escopo</w:t>
+              <w:t xml:space="preserve">Status</w:t>
             </w:r>
           </w:p>
         </w:tc>
@@ -1846,7 +1914,7 @@
               <w:rPr>
                 <w:sz w:val="19"/>
               </w:rPr>
-              <w:t>A</w:t>
+              <w:t xml:space="preserve">A</w:t>
             </w:r>
           </w:p>
         </w:tc>
@@ -1869,7 +1937,7 @@
               <w:rPr>
                 <w:sz w:val="19"/>
               </w:rPr>
-              <w:t>Atalho do atleta</w:t>
+              <w:t xml:space="preserve">Atalho do atleta (botão na página pública, intenção pendente, modal pré-selecionado)</w:t>
             </w:r>
           </w:p>
         </w:tc>
@@ -1892,7 +1960,7 @@
               <w:rPr>
                 <w:sz w:val="19"/>
               </w:rPr>
-              <w:t>Botão “Jogo nesta Copa” na página pública (visível só se aceita_conexoes), intenção pendente (logado e anônimo), abertura do modal “Me conectar à Copa” pré-selecionado, desvio ao Painel do Atleta quando já conectado. Testes de fluxo + E2E.</w:t>
+              <w:t xml:space="preserve">✅ Em produção</w:t>
             </w:r>
           </w:p>
         </w:tc>
@@ -1917,7 +1985,7 @@
               <w:rPr>
                 <w:sz w:val="19"/>
               </w:rPr>
-              <w:t>B</w:t>
+              <w:t xml:space="preserve">—</w:t>
             </w:r>
           </w:p>
         </w:tc>
@@ -1940,7 +2008,7 @@
               <w:rPr>
                 <w:sz w:val="19"/>
               </w:rPr>
-              <w:t>Central de notificações + aviso de conexão</w:t>
+              <w:t xml:space="preserve">Refino do botão: três estados (aviso de pendente, “Jogando esta Copa”)</w:t>
             </w:r>
           </w:p>
         </w:tc>
@@ -1963,7 +2031,7 @@
               <w:rPr>
                 <w:sz w:val="19"/>
               </w:rPr>
-              <w:t>Sino no topo com contador e dropdown; src/notificacoes.js; GET /api/notificacoes e POST /api/notificacoes/visto; notificação agrupada de solicitações pendentes por copa, clicável para a aba Atletas. Testes de unidade e de API + E2E.</w:t>
+              <w:t xml:space="preserve">✅ Em produção</w:t>
             </w:r>
           </w:p>
         </w:tc>
@@ -1988,7 +2056,7 @@
               <w:rPr>
                 <w:sz w:val="19"/>
               </w:rPr>
-              <w:t>C</w:t>
+              <w:t xml:space="preserve">B</w:t>
             </w:r>
           </w:p>
         </w:tc>
@@ -2011,7 +2079,7 @@
               <w:rPr>
                 <w:sz w:val="19"/>
               </w:rPr>
-              <w:t>Aprovar todas</w:t>
+              <w:t xml:space="preserve">Central de notificações (sino, contador, dropdown) + notificação de conexão agrupada</w:t>
             </w:r>
           </w:p>
         </w:tc>
@@ -2034,7 +2102,78 @@
               <w:rPr>
                 <w:sz w:val="19"/>
               </w:rPr>
-              <w:t>Função aprovarTodasConexoes em src/conexoes.js; POST /api/campeonatos/:id/conexoes/aprovar-todas; botão “Aprovar todas (N)” na aba Atletas com confirmação. Testes de unidade e de API + E2E.</w:t>
+              <w:t xml:space="preserve">✅ Em produção</w:t>
+            </w:r>
+          </w:p>
+        </w:tc>
+      </w:tr>
+      <w:tr>
+        <w:tc>
+          <w:tcPr>
+            <w:tcW w:w="900" w:type="dxa"/>
+            <w:tcBorders>
+              <w:top w:val="single" w:sz="4" w:space="0" w:color="CCCCCC"/>
+              <w:left w:val="single" w:sz="4" w:space="0" w:color="CCCCCC"/>
+              <w:bottom w:val="single" w:sz="4" w:space="0" w:color="CCCCCC"/>
+              <w:right w:val="single" w:sz="4" w:space="0" w:color="CCCCCC"/>
+            </w:tcBorders>
+            <w:vAlign w:val="center"/>
+          </w:tcPr>
+          <w:p>
+            <w:pPr>
+              <w:spacing w:before="40" w:after="40"/>
+            </w:pPr>
+            <w:r>
+              <w:rPr>
+                <w:sz w:val="19"/>
+              </w:rPr>
+              <w:t xml:space="preserve">C</w:t>
+            </w:r>
+          </w:p>
+        </w:tc>
+        <w:tc>
+          <w:tcPr>
+            <w:tcW w:w="3000" w:type="dxa"/>
+            <w:tcBorders>
+              <w:top w:val="single" w:sz="4" w:space="0" w:color="CCCCCC"/>
+              <w:left w:val="single" w:sz="4" w:space="0" w:color="CCCCCC"/>
+              <w:bottom w:val="single" w:sz="4" w:space="0" w:color="CCCCCC"/>
+              <w:right w:val="single" w:sz="4" w:space="0" w:color="CCCCCC"/>
+            </w:tcBorders>
+            <w:vAlign w:val="center"/>
+          </w:tcPr>
+          <w:p>
+            <w:pPr>
+              <w:spacing w:before="40" w:after="40"/>
+            </w:pPr>
+            <w:r>
+              <w:rPr>
+                <w:sz w:val="19"/>
+              </w:rPr>
+              <w:t xml:space="preserve">Aprovar todas (botão na aba Atletas com confirmação)</w:t>
+            </w:r>
+          </w:p>
+        </w:tc>
+        <w:tc>
+          <w:tcPr>
+            <w:tcW w:w="5450" w:type="dxa"/>
+            <w:tcBorders>
+              <w:top w:val="single" w:sz="4" w:space="0" w:color="CCCCCC"/>
+              <w:left w:val="single" w:sz="4" w:space="0" w:color="CCCCCC"/>
+              <w:bottom w:val="single" w:sz="4" w:space="0" w:color="CCCCCC"/>
+              <w:right w:val="single" w:sz="4" w:space="0" w:color="CCCCCC"/>
+            </w:tcBorders>
+            <w:vAlign w:val="center"/>
+          </w:tcPr>
+          <w:p>
+            <w:pPr>
+              <w:spacing w:before="40" w:after="40"/>
+            </w:pPr>
+            <w:r>
+              <w:rPr>
+                <w:sz w:val="19"/>
+              </w:rPr>
+              <w:t xml:space="preserve">✅ Em produção</w:t>
             </w:r>
           </w:p>
         </w:tc>
@@ -2042,7 +2181,7 @@
     </w:tbl>
     <w:p>
       <w:r>
-        <w:t>Cada fase é comitável e verificável isoladamente no app real (servidor + Edge headless via CDP), no padrão das entregas anteriores. Fases A, B e C podem ir a produção juntas ou em sequência.</w:t>
+        <w:t xml:space="preserve">Tudo entregue no commit 6595ecc e verificado no app real (servidor + Edge headless via CDP) e ao vivo em copamanager.com.br. 186 testes automatizados. Sem migração de banco.</w:t>
       </w:r>
     </w:p>
     <w:p>
@@ -2050,7 +2189,7 @@
         <w:pStyle w:val="Heading1"/>
       </w:pPr>
       <w:r>
-        <w:t>7. Questões em aberto (decisões a confirmar)</w:t>
+        <w:t xml:space="preserve">7. Decisões (questões resolvidas)</w:t>
       </w:r>
     </w:p>
     <w:tbl>
@@ -2066,8 +2205,8 @@
       </w:tblPr>
       <w:tblGrid>
         <w:gridCol w:w="3200"/>
+        <w:gridCol w:w="3050"/>
         <w:gridCol w:w="3100"/>
-        <w:gridCol w:w="3050"/>
       </w:tblGrid>
       <w:tr>
         <w:tc>
@@ -2092,13 +2231,13 @@
                 <w:color w:val="FFFFFF"/>
                 <w:sz w:val="19"/>
               </w:rPr>
-              <w:t>Questão</w:t>
-            </w:r>
-          </w:p>
-        </w:tc>
-        <w:tc>
-          <w:tcPr>
-            <w:tcW w:w="3100" w:type="dxa"/>
+              <w:t xml:space="preserve">Questão</w:t>
+            </w:r>
+          </w:p>
+        </w:tc>
+        <w:tc>
+          <w:tcPr>
+            <w:tcW w:w="3050" w:type="dxa"/>
             <w:tcBorders>
               <w:top w:val="single" w:sz="4" w:space="0" w:color="CCCCCC"/>
               <w:left w:val="single" w:sz="4" w:space="0" w:color="CCCCCC"/>
@@ -2118,13 +2257,13 @@
                 <w:color w:val="FFFFFF"/>
                 <w:sz w:val="19"/>
               </w:rPr>
-              <w:t>Proposta</w:t>
-            </w:r>
-          </w:p>
-        </w:tc>
-        <w:tc>
-          <w:tcPr>
-            <w:tcW w:w="3050" w:type="dxa"/>
+              <w:t xml:space="preserve">Proposta inicial</w:t>
+            </w:r>
+          </w:p>
+        </w:tc>
+        <w:tc>
+          <w:tcPr>
+            <w:tcW w:w="3100" w:type="dxa"/>
             <w:tcBorders>
               <w:top w:val="single" w:sz="4" w:space="0" w:color="CCCCCC"/>
               <w:left w:val="single" w:sz="4" w:space="0" w:color="CCCCCC"/>
@@ -2144,7 +2283,7 @@
                 <w:color w:val="FFFFFF"/>
                 <w:sz w:val="19"/>
               </w:rPr>
-              <w:t>Resposta</w:t>
+              <w:t xml:space="preserve">Resposta (aplicada)</w:t>
             </w:r>
           </w:p>
         </w:tc>
@@ -2169,7 +2308,30 @@
               <w:rPr>
                 <w:sz w:val="19"/>
               </w:rPr>
-              <w:t>Nome do botão da página pública.</w:t>
+              <w:t xml:space="preserve">Nome do botão da página pública.</w:t>
+            </w:r>
+          </w:p>
+        </w:tc>
+        <w:tc>
+          <w:tcPr>
+            <w:tcW w:w="3050" w:type="dxa"/>
+            <w:tcBorders>
+              <w:top w:val="single" w:sz="4" w:space="0" w:color="CCCCCC"/>
+              <w:left w:val="single" w:sz="4" w:space="0" w:color="CCCCCC"/>
+              <w:bottom w:val="single" w:sz="4" w:space="0" w:color="CCCCCC"/>
+              <w:right w:val="single" w:sz="4" w:space="0" w:color="CCCCCC"/>
+            </w:tcBorders>
+            <w:vAlign w:val="center"/>
+          </w:tcPr>
+          <w:p>
+            <w:pPr>
+              <w:spacing w:before="40" w:after="40"/>
+            </w:pPr>
+            <w:r>
+              <w:rPr>
+                <w:sz w:val="19"/>
+              </w:rPr>
+              <w:t xml:space="preserve">“Jogo nesta Copa” + alternativas.</w:t>
             </w:r>
           </w:p>
         </w:tc>
@@ -2192,27 +2354,7 @@
               <w:rPr>
                 <w:sz w:val="19"/>
               </w:rPr>
-              <w:t>“Jogo nesta Copa” (curto e convidativo). Alternativas: “Sou atleta desta Copa”, “Sou atleta”, “Conectar meu perfil”.</w:t>
-            </w:r>
-          </w:p>
-        </w:tc>
-        <w:tc>
-          <w:tcPr>
-            <w:tcW w:w="3050" w:type="dxa"/>
-            <w:tcBorders>
-              <w:top w:val="single" w:sz="4" w:space="0" w:color="CCCCCC"/>
-              <w:left w:val="single" w:sz="4" w:space="0" w:color="CCCCCC"/>
-              <w:bottom w:val="single" w:sz="4" w:space="0" w:color="CCCCCC"/>
-              <w:right w:val="single" w:sz="4" w:space="0" w:color="CCCCCC"/>
-            </w:tcBorders>
-            <w:vAlign w:val="center"/>
-          </w:tcPr>
-          <w:p>
-            <w:pPr>
-              <w:spacing w:before="40" w:after="40"/>
-            </w:pPr>
-            <w:r>
-              <w:t>“Eu jogo nesta Copa”</w:t>
+              <w:t xml:space="preserve">“Eu jogo nesta Copa”.</w:t>
             </w:r>
           </w:p>
         </w:tc>
@@ -2237,7 +2379,30 @@
               <w:rPr>
                 <w:sz w:val="19"/>
               </w:rPr>
-              <w:t>Estado de “lido” das notificações: coluna no banco ou localStorage?</w:t>
+              <w:t xml:space="preserve">Estado de “lido” das notificações: coluna no banco ou localStorage?</w:t>
+            </w:r>
+          </w:p>
+        </w:tc>
+        <w:tc>
+          <w:tcPr>
+            <w:tcW w:w="3050" w:type="dxa"/>
+            <w:tcBorders>
+              <w:top w:val="single" w:sz="4" w:space="0" w:color="CCCCCC"/>
+              <w:left w:val="single" w:sz="4" w:space="0" w:color="CCCCCC"/>
+              <w:bottom w:val="single" w:sz="4" w:space="0" w:color="CCCCCC"/>
+              <w:right w:val="single" w:sz="4" w:space="0" w:color="CCCCCC"/>
+            </w:tcBorders>
+            <w:vAlign w:val="center"/>
+          </w:tcPr>
+          <w:p>
+            <w:pPr>
+              <w:spacing w:before="40" w:after="40"/>
+            </w:pPr>
+            <w:r>
+              <w:rPr>
+                <w:sz w:val="19"/>
+              </w:rPr>
+              <w:t xml:space="preserve">localStorage no MVP.</w:t>
             </w:r>
           </w:p>
         </w:tc>
@@ -2260,27 +2425,7 @@
               <w:rPr>
                 <w:sz w:val="19"/>
               </w:rPr>
-              <w:t>localStorage no MVP (zero migração); migrar para coluna contas.notificacoes_vistas_em quando houver notificação multi-dispositivo.</w:t>
-            </w:r>
-          </w:p>
-        </w:tc>
-        <w:tc>
-          <w:tcPr>
-            <w:tcW w:w="3050" w:type="dxa"/>
-            <w:tcBorders>
-              <w:top w:val="single" w:sz="4" w:space="0" w:color="CCCCCC"/>
-              <w:left w:val="single" w:sz="4" w:space="0" w:color="CCCCCC"/>
-              <w:bottom w:val="single" w:sz="4" w:space="0" w:color="CCCCCC"/>
-              <w:right w:val="single" w:sz="4" w:space="0" w:color="CCCCCC"/>
-            </w:tcBorders>
-            <w:vAlign w:val="center"/>
-          </w:tcPr>
-          <w:p>
-            <w:pPr>
-              <w:spacing w:before="40" w:after="40"/>
-            </w:pPr>
-            <w:r>
-              <w:t>localStorage</w:t>
+              <w:t xml:space="preserve">localStorage.</w:t>
             </w:r>
           </w:p>
         </w:tc>
@@ -2305,7 +2450,30 @@
               <w:rPr>
                 <w:sz w:val="19"/>
               </w:rPr>
-              <w:t>Renomear a aba “Atletas” para “Alertas”?</w:t>
+              <w:t xml:space="preserve">Renomear a aba “Atletas” para “Alertas”?</w:t>
+            </w:r>
+          </w:p>
+        </w:tc>
+        <w:tc>
+          <w:tcPr>
+            <w:tcW w:w="3050" w:type="dxa"/>
+            <w:tcBorders>
+              <w:top w:val="single" w:sz="4" w:space="0" w:color="CCCCCC"/>
+              <w:left w:val="single" w:sz="4" w:space="0" w:color="CCCCCC"/>
+              <w:bottom w:val="single" w:sz="4" w:space="0" w:color="CCCCCC"/>
+              <w:right w:val="single" w:sz="4" w:space="0" w:color="CCCCCC"/>
+            </w:tcBorders>
+            <w:vAlign w:val="center"/>
+          </w:tcPr>
+          <w:p>
+            <w:pPr>
+              <w:spacing w:before="40" w:after="40"/>
+            </w:pPr>
+            <w:r>
+              <w:rPr>
+                <w:sz w:val="19"/>
+              </w:rPr>
+              <w:t xml:space="preserve">Manter “Atletas”.</w:t>
             </w:r>
           </w:p>
         </w:tc>
@@ -2328,27 +2496,7 @@
               <w:rPr>
                 <w:sz w:val="19"/>
               </w:rPr>
-              <w:t>Manter “Atletas” (descreve o conteúdo). O sino já cobre a função de “alerta” global.</w:t>
-            </w:r>
-          </w:p>
-        </w:tc>
-        <w:tc>
-          <w:tcPr>
-            <w:tcW w:w="3050" w:type="dxa"/>
-            <w:tcBorders>
-              <w:top w:val="single" w:sz="4" w:space="0" w:color="CCCCCC"/>
-              <w:left w:val="single" w:sz="4" w:space="0" w:color="CCCCCC"/>
-              <w:bottom w:val="single" w:sz="4" w:space="0" w:color="CCCCCC"/>
-              <w:right w:val="single" w:sz="4" w:space="0" w:color="CCCCCC"/>
-            </w:tcBorders>
-            <w:vAlign w:val="center"/>
-          </w:tcPr>
-          <w:p>
-            <w:pPr>
-              <w:spacing w:before="40" w:after="40"/>
-            </w:pPr>
-            <w:r>
-              <w:t>Manter Atletas</w:t>
+              <w:t xml:space="preserve">Manter “Atletas”.</w:t>
             </w:r>
           </w:p>
         </w:tc>
@@ -2373,7 +2521,30 @@
               <w:rPr>
                 <w:sz w:val="19"/>
               </w:rPr>
-              <w:t>Quem recebe a notificação e pode aprovar: só o dono ou também colaboradores com acesso?</w:t>
+              <w:t xml:space="preserve">Quem recebe a notificação e pode aprovar?</w:t>
+            </w:r>
+          </w:p>
+        </w:tc>
+        <w:tc>
+          <w:tcPr>
+            <w:tcW w:w="3050" w:type="dxa"/>
+            <w:tcBorders>
+              <w:top w:val="single" w:sz="4" w:space="0" w:color="CCCCCC"/>
+              <w:left w:val="single" w:sz="4" w:space="0" w:color="CCCCCC"/>
+              <w:bottom w:val="single" w:sz="4" w:space="0" w:color="CCCCCC"/>
+              <w:right w:val="single" w:sz="4" w:space="0" w:color="CCCCCC"/>
+            </w:tcBorders>
+            <w:vAlign w:val="center"/>
+          </w:tcPr>
+          <w:p>
+            <w:pPr>
+              <w:spacing w:before="40" w:after="40"/>
+            </w:pPr>
+            <w:r>
+              <w:rPr>
+                <w:sz w:val="19"/>
+              </w:rPr>
+              <w:t xml:space="preserve">Só o dono no MVP.</w:t>
             </w:r>
           </w:p>
         </w:tc>
@@ -2396,27 +2567,7 @@
               <w:rPr>
                 <w:sz w:val="19"/>
               </w:rPr>
-              <w:t>Só o dono no MVP (a aba Atletas já é dono-only). Estender a colaboradores depois, se pedido.</w:t>
-            </w:r>
-          </w:p>
-        </w:tc>
-        <w:tc>
-          <w:tcPr>
-            <w:tcW w:w="3050" w:type="dxa"/>
-            <w:tcBorders>
-              <w:top w:val="single" w:sz="4" w:space="0" w:color="CCCCCC"/>
-              <w:left w:val="single" w:sz="4" w:space="0" w:color="CCCCCC"/>
-              <w:bottom w:val="single" w:sz="4" w:space="0" w:color="CCCCCC"/>
-              <w:right w:val="single" w:sz="4" w:space="0" w:color="CCCCCC"/>
-            </w:tcBorders>
-            <w:vAlign w:val="center"/>
-          </w:tcPr>
-          <w:p>
-            <w:pPr>
-              <w:spacing w:before="40" w:after="40"/>
-            </w:pPr>
-            <w:r>
-              <w:t>Só o dono</w:t>
+              <w:t xml:space="preserve">Só o dono.</w:t>
             </w:r>
           </w:p>
         </w:tc>
@@ -2441,7 +2592,30 @@
               <w:rPr>
                 <w:sz w:val="19"/>
               </w:rPr>
-              <w:t>“Aprovar todas” pede confirmação?</w:t>
+              <w:t xml:space="preserve">“Aprovar todas” pede confirmação?</w:t>
+            </w:r>
+          </w:p>
+        </w:tc>
+        <w:tc>
+          <w:tcPr>
+            <w:tcW w:w="3050" w:type="dxa"/>
+            <w:tcBorders>
+              <w:top w:val="single" w:sz="4" w:space="0" w:color="CCCCCC"/>
+              <w:left w:val="single" w:sz="4" w:space="0" w:color="CCCCCC"/>
+              <w:bottom w:val="single" w:sz="4" w:space="0" w:color="CCCCCC"/>
+              <w:right w:val="single" w:sz="4" w:space="0" w:color="CCCCCC"/>
+            </w:tcBorders>
+            <w:vAlign w:val="center"/>
+          </w:tcPr>
+          <w:p>
+            <w:pPr>
+              <w:spacing w:before="40" w:after="40"/>
+            </w:pPr>
+            <w:r>
+              <w:rPr>
+                <w:sz w:val="19"/>
+              </w:rPr>
+              <w:t xml:space="preserve">Sim.</w:t>
             </w:r>
           </w:p>
         </w:tc>
@@ -2464,27 +2638,7 @@
               <w:rPr>
                 <w:sz w:val="19"/>
               </w:rPr>
-              <w:t>Sim — ação em lote irreversível sem revisão individual merece um passo de confirmação.</w:t>
-            </w:r>
-          </w:p>
-        </w:tc>
-        <w:tc>
-          <w:tcPr>
-            <w:tcW w:w="3050" w:type="dxa"/>
-            <w:tcBorders>
-              <w:top w:val="single" w:sz="4" w:space="0" w:color="CCCCCC"/>
-              <w:left w:val="single" w:sz="4" w:space="0" w:color="CCCCCC"/>
-              <w:bottom w:val="single" w:sz="4" w:space="0" w:color="CCCCCC"/>
-              <w:right w:val="single" w:sz="4" w:space="0" w:color="CCCCCC"/>
-            </w:tcBorders>
-            <w:vAlign w:val="center"/>
-          </w:tcPr>
-          <w:p>
-            <w:pPr>
-              <w:spacing w:before="40" w:after="40"/>
-            </w:pPr>
-            <w:r>
-              <w:t>Sim, pede confirmação</w:t>
+              <w:t xml:space="preserve">Sim, pede confirmação.</w:t>
             </w:r>
           </w:p>
         </w:tc>
@@ -2509,7 +2663,30 @@
               <w:rPr>
                 <w:sz w:val="19"/>
               </w:rPr>
-              <w:t>Notificar o atleta quando a conexão for aprovada/recusada?</w:t>
+              <w:t xml:space="preserve">Notificar o atleta quando a conexão for aprovada/recusada?</w:t>
+            </w:r>
+          </w:p>
+        </w:tc>
+        <w:tc>
+          <w:tcPr>
+            <w:tcW w:w="3050" w:type="dxa"/>
+            <w:tcBorders>
+              <w:top w:val="single" w:sz="4" w:space="0" w:color="CCCCCC"/>
+              <w:left w:val="single" w:sz="4" w:space="0" w:color="CCCCCC"/>
+              <w:bottom w:val="single" w:sz="4" w:space="0" w:color="CCCCCC"/>
+              <w:right w:val="single" w:sz="4" w:space="0" w:color="CCCCCC"/>
+            </w:tcBorders>
+            <w:vAlign w:val="center"/>
+          </w:tcPr>
+          <w:p>
+            <w:pPr>
+              <w:spacing w:before="40" w:after="40"/>
+            </w:pPr>
+            <w:r>
+              <w:rPr>
+                <w:sz w:val="19"/>
+              </w:rPr>
+              <w:t xml:space="preserve">Fora do escopo; evolução futura.</w:t>
             </w:r>
           </w:p>
         </w:tc>
@@ -2532,27 +2709,7 @@
               <w:rPr>
                 <w:sz w:val="19"/>
               </w:rPr>
-              <w:t>Fora do escopo do MVP; a central já nasce preparada para esse tipo. Boa evolução seguinte.</w:t>
-            </w:r>
-          </w:p>
-        </w:tc>
-        <w:tc>
-          <w:tcPr>
-            <w:tcW w:w="3050" w:type="dxa"/>
-            <w:tcBorders>
-              <w:top w:val="single" w:sz="4" w:space="0" w:color="CCCCCC"/>
-              <w:left w:val="single" w:sz="4" w:space="0" w:color="CCCCCC"/>
-              <w:bottom w:val="single" w:sz="4" w:space="0" w:color="CCCCCC"/>
-              <w:right w:val="single" w:sz="4" w:space="0" w:color="CCCCCC"/>
-            </w:tcBorders>
-            <w:vAlign w:val="center"/>
-          </w:tcPr>
-          <w:p>
-            <w:pPr>
-              <w:spacing w:before="40" w:after="40"/>
-            </w:pPr>
-            <w:r>
-              <w:t>Não</w:t>
+              <w:t xml:space="preserve">Não (evolução futura).</w:t>
             </w:r>
           </w:p>
         </w:tc>
@@ -2577,7 +2734,30 @@
               <w:rPr>
                 <w:sz w:val="19"/>
               </w:rPr>
-              <w:t>O botão da página pública também deve “seguir” a copa, ou só abrir a conexão?</w:t>
+              <w:t xml:space="preserve">O botão da página pública também deve “seguir” a copa?</w:t>
+            </w:r>
+          </w:p>
+        </w:tc>
+        <w:tc>
+          <w:tcPr>
+            <w:tcW w:w="3050" w:type="dxa"/>
+            <w:tcBorders>
+              <w:top w:val="single" w:sz="4" w:space="0" w:color="CCCCCC"/>
+              <w:left w:val="single" w:sz="4" w:space="0" w:color="CCCCCC"/>
+              <w:bottom w:val="single" w:sz="4" w:space="0" w:color="CCCCCC"/>
+              <w:right w:val="single" w:sz="4" w:space="0" w:color="CCCCCC"/>
+            </w:tcBorders>
+            <w:vAlign w:val="center"/>
+          </w:tcPr>
+          <w:p>
+            <w:pPr>
+              <w:spacing w:before="40" w:after="40"/>
+            </w:pPr>
+            <w:r>
+              <w:rPr>
+                <w:sz w:val="19"/>
+              </w:rPr>
+              <w:t xml:space="preserve">Seguir + abrir.</w:t>
             </w:r>
           </w:p>
         </w:tc>
@@ -2600,39 +2780,30 @@
               <w:rPr>
                 <w:sz w:val="19"/>
               </w:rPr>
-              <w:t>Seguir + abrir: seguir é pré-requisito técnico do fluxo de conexão e deixa a copa no painel do atleta.</w:t>
-            </w:r>
-          </w:p>
-        </w:tc>
-        <w:tc>
-          <w:tcPr>
-            <w:tcW w:w="3050" w:type="dxa"/>
-            <w:tcBorders>
-              <w:top w:val="single" w:sz="4" w:space="0" w:color="CCCCCC"/>
-              <w:left w:val="single" w:sz="4" w:space="0" w:color="CCCCCC"/>
-              <w:bottom w:val="single" w:sz="4" w:space="0" w:color="CCCCCC"/>
-              <w:right w:val="single" w:sz="4" w:space="0" w:color="CCCCCC"/>
-            </w:tcBorders>
-            <w:vAlign w:val="center"/>
-          </w:tcPr>
-          <w:p>
-            <w:pPr>
-              <w:spacing w:before="40" w:after="40"/>
-            </w:pPr>
-            <w:r>
-              <w:t>Deve seguir</w:t>
+              <w:t xml:space="preserve">Deve seguir.</w:t>
             </w:r>
           </w:p>
         </w:tc>
       </w:tr>
     </w:tbl>
+    <w:p>
+      <w:r>
+        <w:rPr>
+          <w:b/>
+        </w:rPr>
+        <w:t xml:space="preserve">Refino incorporado depois da v1.0:</w:t>
+      </w:r>
+      <w:r>
+        <w:t xml:space="preserve"> a pedido do organizador, o botão passou a refletir o estado da conexão (aviso de pendente e “Jogando esta Copa”) — documentado em 2.2 e RN-NT-03.</w:t>
+      </w:r>
+    </w:p>
     <w:p/>
     <w:p>
       <w:pPr>
         <w:pStyle w:val="Muted"/>
       </w:pPr>
       <w:r>
-        <w:t>— Fim do documento —</w:t>
+        <w:t xml:space="preserve">— Fim do documento (v1.1 as-built) —</w:t>
       </w:r>
     </w:p>
     <w:sectPr>

</xml_diff>